<commit_message>
feat(data): simplificar seleccion de usuarios con incluir_sgd
</commit_message>
<xml_diff>
--- a/manual/Manual-Instalacion-SGD-INIA-PG-Actualizado.docx
+++ b/manual/Manual-Instalacion-SGD-INIA-PG-Actualizado.docx
@@ -558,7 +558,7 @@
           <w:rFonts w:ascii="Calibri" w:hAnsi="Calibri"/>
           <w:sz w:val="21"/>
         </w:rPr>
-        <w:t>2. Confirmar con el responsable del área quién participa. Excluir cesados, cuentas genéricas y personas sin autorización. Tomar sólo los iCodTrabajador aprobados. Conservar los registros del sistema anterior.</w:t>
+        <w:t>2. Confirmar con el responsable del área quién participa. La selección se marca después en usuarios-verificados.csv: incluir_sgd=1 para incluir e incluir_sgd=0 para excluir cesados, cuentas genéricas o personas sin autorización. Conservar los registros del sistema anterior.</w:t>
       </w:r>
     </w:p>
     <w:p>
@@ -570,31 +570,7 @@
           <w:rFonts w:ascii="Calibri" w:hAnsi="Calibri"/>
           <w:sz w:val="21"/>
         </w:rPr>
-        <w:t>3. Abrir bd/Exportar-Area-SQLServer.sql, indicar el mismo @Oficina y completar @Aprobados. Descomentar el INSERT y sustituir estos IDs ficticios por los revisados:</w:t>
-      </w:r>
-    </w:p>
-    <w:p>
-      <w:pPr>
-        <w:spacing w:after="140"/>
-      </w:pPr>
-      <w:r>
-        <w:rPr>
-          <w:rFonts w:ascii="Consolas" w:hAnsi="Consolas"/>
-          <w:sz w:val="18"/>
-        </w:rPr>
-        <w:t>INSERT INTO @Aprobados(iCodTrabajador) VALUES (101),(102);</w:t>
-      </w:r>
-    </w:p>
-    <w:p>
-      <w:pPr>
-        <w:spacing w:after="140"/>
-      </w:pPr>
-      <w:r>
-        <w:rPr>
-          <w:rFonts w:ascii="Calibri" w:hAnsi="Calibri"/>
-          <w:sz w:val="21"/>
-        </w:rPr>
-        <w:t>101 y 102 son ejemplos, no IDs confirmados. Una lista vacía bloquea la exportación. IDs inexistentes, ajenos al área o fuera del filtro de estado también la detienen. El filtro se aplica a trabajadores, perfiles y asignaciones. Ejecutar el archivo completo; @Personal sólo existe en esa ejecución.</w:t>
+        <w:t>3. Abrir bd/Exportar-Area-SQLServer.sql e indicar únicamente @Oficina con el código del área. Ejecutar el archivo completo y guardar sus cinco resultados. No hay una lista adicional de IDs que completar. La revisión y selección se realizan en el CSV preparado.</w:t>
       </w:r>
     </w:p>
     <w:p>
@@ -787,7 +763,7 @@
           <w:rFonts w:ascii="Calibri" w:hAnsi="Calibri"/>
           <w:sz w:val="21"/>
         </w:rPr>
-        <w:t>2. Eliminar la fila completa de cualquier cesado, cuenta genérica o persona no autorizada. Confirmar DNI real de ocho dígitos, nombres y apellidos, usuario, cargo_codigo de cuatro dígitos y perfil aprobado. Marcar verificado=SI sólo después de revisar. Una fila con NO bloquea toda la carga; no se omite automáticamente.</w:t>
+        <w:t>2. En usuarios-verificados.csv usar incluir_sgd: 1 = incluir; 0 = excluir. Poner 0 a cesados, cuentas genéricas y personas que no participarán. Sus filas se omiten y pueden conservar verificado=NO. Para quienes tengan 1, confirmar DNI real, nombres, apellidos, cargo y perfil, y marcar verificado=SI después de revisar. Una fila con 1 y verificado=NO bloquea la carga.</w:t>
       </w:r>
     </w:p>
     <w:p>
@@ -875,7 +851,7 @@
           <w:rFonts w:ascii="Calibri" w:hAnsi="Calibri"/>
           <w:sz w:val="21"/>
         </w:rPr>
-        <w:t>Se genera un plan privado para revisión; no ejecutarlo manualmente. Esta validación no comprueba colisiones actuales en PostgreSQL. Detalle y alternativa manual: manual/CARGA-POR-AREA.md. Las 18 pruebas offline usan datos ficticios; la carga real sigue pendiente de tu ejecución.</w:t>
+        <w:t>Se genera un plan privado para revisión; no ejecutarlo manualmente. Esta validación no comprueba colisiones actuales en PostgreSQL. Detalle y alternativa manual: manual/CARGA-POR-AREA.md. Las 21 pruebas offline usan datos ficticios; la carga real sigue pendiente de tu ejecución. Los CSV anteriores siguen siendo compatibles; para usar el selector añadir incluir_sgd al final del encabezado y 1 o 0 al final de cada fila. Las nuevas plantillas ya lo incluyen.</w:t>
       </w:r>
     </w:p>
     <w:p>

</xml_diff>

<commit_message>
fix(instalacion): integrar sede inicial y validar carga y retiro del piloto
</commit_message>
<xml_diff>
--- a/manual/Manual-Instalacion-SGD-INIA-PG-Actualizado.docx
+++ b/manual/Manual-Instalacion-SGD-INIA-PG-Actualizado.docx
@@ -582,7 +582,7 @@
           <w:rFonts w:ascii="Calibri" w:hAnsi="Calibri"/>
           <w:sz w:val="21"/>
         </w:rPr>
-        <w:t>4. Crear datos/exportacion-uti. Ejecutar SQL sólo muestra cuadrículas; todavía no crea archivos. En cada resultado usar clic derecho, Guardar resultados como, tipo CSV. Activar encabezados en las opciones de resultados a cuadrícula de SSMS; si no se reflejan, abrir otra ventana de consulta. Verificar la primera línea del archivo.</w:t>
+        <w:t>4. Crear datos/exportacion-uti. Ejecutar SQL sólo muestra cuadrículas; todavía no crea archivos. En cada resultado usar clic derecho, Guardar resultados como, tipo CSV. Se admite sin encabezados: no hace falta copiar y pegar ni cambiar opciones de SSMS. Mantener el orden de columnas del tercer SQL y guardar cada resultado con su nombre correspondiente.</w:t>
       </w:r>
     </w:p>
     <w:p>
@@ -626,7 +626,7 @@
           <w:rFonts w:ascii="Calibri" w:hAnsi="Calibri"/>
           <w:sz w:val="21"/>
         </w:rPr>
-        <w:t>Conservar los originales con encabezados y sin claves ni hashes. datos está excluido de Git. No ejecutar nuevamente los SQL de instalación inicial.</w:t>
+        <w:t>Conservar los cinco originales, con o sin encabezados, sin claves ni hashes. datos está excluido de Git. El preparador no modifica los originales y crea el CSV preparado con encabezados e incluir_sgd. No ejecutar nuevamente los SQL de instalación inicial.</w:t>
       </w:r>
     </w:p>
     <w:p>
@@ -653,7 +653,7 @@
           <w:rFonts w:ascii="Calibri" w:hAnsi="Calibri"/>
           <w:sz w:val="30"/>
         </w:rPr>
-        <w:t>11 Preparar y revisar los archivos de carga</w:t>
+        <w:t>11 Preparar el CSV y seleccionar personas</w:t>
       </w:r>
     </w:p>
     <w:p>
@@ -665,7 +665,7 @@
           <w:rFonts w:ascii="Calibri" w:hAnsi="Calibri"/>
           <w:sz w:val="21"/>
         </w:rPr>
-        <w:t>El preparador convierte los cinco CSV a un borrador. Usa datos/exportacion-uti como origen y crea datos/carga-uti-preparada; no conecta a bases ni sobrescribe una preparación anterior.</w:t>
+        <w:t>Guardar los cinco CSV en datos/exportacion-uti. Se admiten con o sin encabezados. Mantener el orden del tercer SQL: ubicaciones 4 columnas, oficinas 11, trabajadores 16, perfiles 3 y asignaciones 4. El preparador no modifica los originales ni conecta a bases.</w:t>
       </w:r>
     </w:p>
     <w:p>
@@ -725,7 +725,43 @@
           <w:rFonts w:ascii="Calibri" w:hAnsi="Calibri"/>
           <w:sz w:val="21"/>
         </w:rPr>
-        <w:t>Para otra área o una nueva revisión elegir carpetas distintas:</w:t>
+        <w:t>El comando crea datos/carga-uti-preparada con cuatro archivos. Abrir usuarios-verificados.csv para revisar personas y area.json para completar el área. pendientes.csv y LEEME.txt son ayudas de revisión. No volver a ejecutar la preparación sobre una carpeta ya revisada; el utilitario impide sobrescribirla.</w:t>
+      </w:r>
+    </w:p>
+    <w:p>
+      <w:pPr>
+        <w:spacing w:after="140"/>
+      </w:pPr>
+      <w:r>
+        <w:rPr>
+          <w:rFonts w:ascii="Calibri" w:hAnsi="Calibri"/>
+          <w:sz w:val="21"/>
+        </w:rPr>
+        <w:t>En usuarios-verificados.csv, incluir_sgd=0 excluye a la persona aunque conserve verificado=NO. incluir_sgd=1 la selecciona; sólo marcar verificado=SI después de revisar identidad, cargo y permisos. Excluir cesados, cuentas genéricas y personas no autorizadas. No elimina sus registros del origen.</w:t>
+      </w:r>
+    </w:p>
+    <w:p>
+      <w:pPr>
+        <w:spacing w:after="140"/>
+      </w:pPr>
+      <w:r>
+        <w:rPr>
+          <w:rFonts w:ascii="Calibri" w:hAnsi="Calibri"/>
+          <w:sz w:val="21"/>
+        </w:rPr>
+        <w:t>Seleccionar personas es sólo el primer paso. Antes de cargar, completar los campos indicados en la página siguiente. Una fila con 1 necesita todos sus datos obligatorios; una fila con 0 se omite. El CSV preparado se guarda en UTF-8 separado por coma y conserva los encabezados.</w:t>
+      </w:r>
+    </w:p>
+    <w:p>
+      <w:pPr>
+        <w:spacing w:after="140"/>
+      </w:pPr>
+      <w:r>
+        <w:rPr>
+          <w:rFonts w:ascii="Calibri" w:hAnsi="Calibri"/>
+          <w:sz w:val="21"/>
+        </w:rPr>
+        <w:t>Para otra área o una nueva exportación, elegir carpetas diferentes:</w:t>
       </w:r>
     </w:p>
     <w:p>
@@ -751,7 +787,7 @@
           <w:rFonts w:ascii="Calibri" w:hAnsi="Calibri"/>
           <w:sz w:val="21"/>
         </w:rPr>
-        <w:t>1. Abrir LEEME.txt y pendientes.csv de la carpeta preparada. Editar usuarios-verificados.csv en VS Code. Cada fila es una persona; conservar los encabezados y usar CSV UTF-8 separado por coma. Se mantienen los apellidos completos en apellido_paterno para que tú los separes y confirmes. Cargo y perfil quedan pendientes.</w:t>
+        <w:t>Los CSV anteriores sin incluir_sgd siguen siendo compatibles: sus filas se consideran incluidas. Para usar el selector añadir incluir_sgd al final del encabezado y 1 o 0 al final de cada fila. Las nuevas plantillas ya lo generan.</w:t>
       </w:r>
     </w:p>
     <w:p>
@@ -763,7 +799,22 @@
           <w:rFonts w:ascii="Calibri" w:hAnsi="Calibri"/>
           <w:sz w:val="21"/>
         </w:rPr>
-        <w:t>2. En usuarios-verificados.csv usar incluir_sgd: 1 = incluir; 0 = excluir. Poner 0 a cesados, cuentas genéricas y personas que no participarán. Sus filas se omiten y pueden conservar verificado=NO. Para quienes tengan 1, confirmar DNI real, nombres, apellidos, cargo y perfil, y marcar verificado=SI después de revisar. Una fila con 1 y verificado=NO bloquea la carga.</w:t>
+        <w:t>Conservar datos en privado y fuera de Git. La preparación y las 25 pruebas offline no equivalen a una carga real ni a la aceptación del ciclo documental.</w:t>
+      </w:r>
+    </w:p>
+    <w:p>
+      <w:pPr>
+        <w:pStyle w:val="Heading1"/>
+        <w:keepNext/>
+        <w:pageBreakBefore/>
+        <w:spacing w:after="140"/>
+      </w:pPr>
+      <w:r>
+        <w:rPr>
+          <w:rFonts w:ascii="Calibri" w:hAnsi="Calibri"/>
+          <w:sz w:val="30"/>
+        </w:rPr>
+        <w:t>12 Completar datos y validar antes de cargar</w:t>
       </w:r>
     </w:p>
     <w:p>
@@ -775,7 +826,7 @@
           <w:rFonts w:ascii="Calibri" w:hAnsi="Calibri"/>
           <w:sz w:val="21"/>
         </w:rPr>
-        <w:t>3. Completar area.json: nombre_corto, sigla, padre, nivel, sede y dirección, titular_empleado, tipos documentales y permisos. Los códigos propuestos son IDs del origen rellenados con ceros; no se comprobaron contra el destino. Mantener la misma equivalencia de empleado entre áreas. El padre 00000 y los perfiles siguen siendo propuestas del laboratorio.</w:t>
+        <w:t>Completar estos campos en datos/carga-uti-preparada. La herramienta no puede inventar DNI, cargos ni responsables. No es necesario volver a exportar ni cambiar los SQL para completar esta revisión.</w:t>
       </w:r>
     </w:p>
     <w:p>
@@ -787,7 +838,246 @@
           <w:rFonts w:ascii="Calibri" w:hAnsi="Calibri"/>
           <w:sz w:val="21"/>
         </w:rPr>
-        <w:t>Consultar personalmente bd/Consultar-Catalogos-Piloto-PostgreSQL.sql para revisar códigos del destino. Aprobar o corregir las equivalencias. Al terminar indicar verificado_por y aprobado=SI en area.json.</w:t>
+        <w:t>Archivo area.json</w:t>
+      </w:r>
+    </w:p>
+    <w:tbl>
+      <w:tblPr>
+        <w:tblStyle w:val="TableGrid"/>
+        <w:tblW w:type="auto" w:w="0"/>
+        <w:tblLook w:firstColumn="1" w:firstRow="1" w:lastColumn="0" w:lastRow="0" w:noHBand="0" w:noVBand="1" w:val="04A0"/>
+      </w:tblPr>
+      <w:tblGrid>
+        <w:gridCol w:w="4968"/>
+        <w:gridCol w:w="4968"/>
+      </w:tblGrid>
+      <w:tr>
+        <w:tc>
+          <w:tcPr>
+            <w:tcW w:type="dxa" w:w="4968"/>
+          </w:tcPr>
+          <w:p>
+            <w:pPr>
+              <w:spacing w:after="80"/>
+            </w:pPr>
+            <w:r>
+              <w:rPr>
+                <w:rFonts w:ascii="Calibri" w:hAnsi="Calibri"/>
+                <w:sz w:val="20"/>
+              </w:rPr>
+              <w:t>Campo</w:t>
+            </w:r>
+          </w:p>
+        </w:tc>
+        <w:tc>
+          <w:tcPr>
+            <w:tcW w:type="dxa" w:w="4968"/>
+          </w:tcPr>
+          <w:p>
+            <w:pPr>
+              <w:spacing w:after="80"/>
+            </w:pPr>
+            <w:r>
+              <w:rPr>
+                <w:rFonts w:ascii="Calibri" w:hAnsi="Calibri"/>
+                <w:sz w:val="20"/>
+              </w:rPr>
+              <w:t>Qué indicar</w:t>
+            </w:r>
+          </w:p>
+        </w:tc>
+      </w:tr>
+      <w:tr>
+        <w:tc>
+          <w:tcPr>
+            <w:tcW w:type="dxa" w:w="4968"/>
+          </w:tcPr>
+          <w:p>
+            <w:pPr>
+              <w:spacing w:after="80"/>
+            </w:pPr>
+            <w:r>
+              <w:rPr>
+                <w:rFonts w:ascii="Calibri" w:hAnsi="Calibri"/>
+                <w:sz w:val="20"/>
+              </w:rPr>
+              <w:t>nombre_corto</w:t>
+            </w:r>
+          </w:p>
+        </w:tc>
+        <w:tc>
+          <w:tcPr>
+            <w:tcW w:type="dxa" w:w="4968"/>
+          </w:tcPr>
+          <w:p>
+            <w:pPr>
+              <w:spacing w:after="80"/>
+            </w:pPr>
+            <w:r>
+              <w:rPr>
+                <w:rFonts w:ascii="Calibri" w:hAnsi="Calibri"/>
+                <w:sz w:val="20"/>
+              </w:rPr>
+              <w:t>UTI para esta área; máximo 20 caracteres.</w:t>
+            </w:r>
+          </w:p>
+        </w:tc>
+      </w:tr>
+      <w:tr>
+        <w:tc>
+          <w:tcPr>
+            <w:tcW w:type="dxa" w:w="4968"/>
+          </w:tcPr>
+          <w:p>
+            <w:pPr>
+              <w:spacing w:after="80"/>
+            </w:pPr>
+            <w:r>
+              <w:rPr>
+                <w:rFonts w:ascii="Calibri" w:hAnsi="Calibri"/>
+                <w:sz w:val="20"/>
+              </w:rPr>
+              <w:t>titular_empleado</w:t>
+            </w:r>
+          </w:p>
+        </w:tc>
+        <w:tc>
+          <w:tcPr>
+            <w:tcW w:type="dxa" w:w="4968"/>
+          </w:tcPr>
+          <w:p>
+            <w:pPr>
+              <w:spacing w:after="80"/>
+            </w:pPr>
+            <w:r>
+              <w:rPr>
+                <w:rFonts w:ascii="Calibri" w:hAnsi="Calibri"/>
+                <w:sz w:val="20"/>
+              </w:rPr>
+              <w:t>Código de cinco dígitos, tomado de codigo_empleado del responsable incluido en el CSV. No usar su DNI ni nombre de usuario.</w:t>
+            </w:r>
+          </w:p>
+        </w:tc>
+      </w:tr>
+      <w:tr>
+        <w:tc>
+          <w:tcPr>
+            <w:tcW w:type="dxa" w:w="4968"/>
+          </w:tcPr>
+          <w:p>
+            <w:pPr>
+              <w:spacing w:after="80"/>
+            </w:pPr>
+            <w:r>
+              <w:rPr>
+                <w:rFonts w:ascii="Calibri" w:hAnsi="Calibri"/>
+                <w:sz w:val="20"/>
+              </w:rPr>
+              <w:t>sede.direccion</w:t>
+            </w:r>
+          </w:p>
+        </w:tc>
+        <w:tc>
+          <w:tcPr>
+            <w:tcW w:type="dxa" w:w="4968"/>
+          </w:tcPr>
+          <w:p>
+            <w:pPr>
+              <w:spacing w:after="80"/>
+            </w:pPr>
+            <w:r>
+              <w:rPr>
+                <w:rFonts w:ascii="Calibri" w:hAnsi="Calibri"/>
+                <w:sz w:val="20"/>
+              </w:rPr>
+              <w:t>Dirección real de la sede, dentro del objeto sede. No sustituir todo el objeto.</w:t>
+            </w:r>
+          </w:p>
+        </w:tc>
+      </w:tr>
+      <w:tr>
+        <w:tc>
+          <w:tcPr>
+            <w:tcW w:type="dxa" w:w="4968"/>
+          </w:tcPr>
+          <w:p>
+            <w:pPr>
+              <w:spacing w:after="80"/>
+            </w:pPr>
+            <w:r>
+              <w:rPr>
+                <w:rFonts w:ascii="Calibri" w:hAnsi="Calibri"/>
+                <w:sz w:val="20"/>
+              </w:rPr>
+              <w:t>verificado_por</w:t>
+            </w:r>
+          </w:p>
+        </w:tc>
+        <w:tc>
+          <w:tcPr>
+            <w:tcW w:type="dxa" w:w="4968"/>
+          </w:tcPr>
+          <w:p>
+            <w:pPr>
+              <w:spacing w:after="80"/>
+            </w:pPr>
+            <w:r>
+              <w:rPr>
+                <w:rFonts w:ascii="Calibri" w:hAnsi="Calibri"/>
+                <w:sz w:val="20"/>
+              </w:rPr>
+              <w:t>Nombre de la persona que revisó y aprobó la carga.</w:t>
+            </w:r>
+          </w:p>
+        </w:tc>
+      </w:tr>
+      <w:tr>
+        <w:tc>
+          <w:tcPr>
+            <w:tcW w:type="dxa" w:w="4968"/>
+          </w:tcPr>
+          <w:p>
+            <w:pPr>
+              <w:spacing w:after="80"/>
+            </w:pPr>
+            <w:r>
+              <w:rPr>
+                <w:rFonts w:ascii="Calibri" w:hAnsi="Calibri"/>
+                <w:sz w:val="20"/>
+              </w:rPr>
+              <w:t>aprobado</w:t>
+            </w:r>
+          </w:p>
+        </w:tc>
+        <w:tc>
+          <w:tcPr>
+            <w:tcW w:type="dxa" w:w="4968"/>
+          </w:tcPr>
+          <w:p>
+            <w:pPr>
+              <w:spacing w:after="80"/>
+            </w:pPr>
+            <w:r>
+              <w:rPr>
+                <w:rFonts w:ascii="Calibri" w:hAnsi="Calibri"/>
+                <w:sz w:val="20"/>
+              </w:rPr>
+              <w:t>SI sólo al terminar de revisar el área, las personas y los permisos.</w:t>
+            </w:r>
+          </w:p>
+        </w:tc>
+      </w:tr>
+    </w:tbl>
+    <w:p>
+      <w:pPr>
+        <w:spacing w:after="140"/>
+      </w:pPr>
+      <w:r>
+        <w:rPr>
+          <w:rFonts w:ascii="Calibri" w:hAnsi="Calibri"/>
+          <w:sz w:val="21"/>
+        </w:rPr>
+        <w:t>Revisar padre, nivel y tipos documentales. El padre 00000 es provisional del laboratorio. Consultar bd/Consultar-Catalogos-Piloto-PostgreSQL.sql: resultado 2 = sedes; resultado 3 = cargos. Conservar la misma equivalencia de empleado entre áreas.</w:t>
       </w:r>
     </w:p>
     <w:p>
@@ -799,7 +1089,258 @@
           <w:rFonts w:ascii="Calibri" w:hAnsi="Calibri"/>
           <w:sz w:val="21"/>
         </w:rPr>
-        <w:t>4. Consultar permisos locales y validar sin aplicar. Windows:</w:t>
+        <w:t>Sede 001: la instalación nueva crea directamente el nombre y dirección reales de la sede central. En bases anteriores, Cargar-Area actualiza automáticamente sólo el registro provisional INSTALACION LOCAL INIA / PENDIENTE, activo y creado por admin, con los datos aprobados en area.json. Se aplica dentro del respaldo y la transacción de la carga; un error revierte también la sede. Otros datos incompatibles se rechazan. No cambia el código ni sus relaciones. No ejecutar un SQL previo ni reinstalar. bd/Actualizar-Sede-Piloto-PostgreSQL.sql queda sólo como alternativa manual de recuperación para la sede central en PostgreSQL.</w:t>
+      </w:r>
+    </w:p>
+    <w:p>
+      <w:pPr>
+        <w:spacing w:after="140"/>
+      </w:pPr>
+      <w:r>
+        <w:rPr>
+          <w:rFonts w:ascii="Calibri" w:hAnsi="Calibri"/>
+          <w:sz w:val="21"/>
+        </w:rPr>
+        <w:t>Archivo usuarios-verificados.csv, sólo filas con incluir_sgd=1</w:t>
+      </w:r>
+    </w:p>
+    <w:tbl>
+      <w:tblPr>
+        <w:tblStyle w:val="TableGrid"/>
+        <w:tblW w:type="auto" w:w="0"/>
+        <w:tblLook w:firstColumn="1" w:firstRow="1" w:lastColumn="0" w:lastRow="0" w:noHBand="0" w:noVBand="1" w:val="04A0"/>
+      </w:tblPr>
+      <w:tblGrid>
+        <w:gridCol w:w="4968"/>
+        <w:gridCol w:w="4968"/>
+      </w:tblGrid>
+      <w:tr>
+        <w:tc>
+          <w:tcPr>
+            <w:tcW w:type="dxa" w:w="4968"/>
+          </w:tcPr>
+          <w:p>
+            <w:pPr>
+              <w:spacing w:after="80"/>
+            </w:pPr>
+            <w:r>
+              <w:rPr>
+                <w:rFonts w:ascii="Calibri" w:hAnsi="Calibri"/>
+                <w:sz w:val="20"/>
+              </w:rPr>
+              <w:t>Campo</w:t>
+            </w:r>
+          </w:p>
+        </w:tc>
+        <w:tc>
+          <w:tcPr>
+            <w:tcW w:type="dxa" w:w="4968"/>
+          </w:tcPr>
+          <w:p>
+            <w:pPr>
+              <w:spacing w:after="80"/>
+            </w:pPr>
+            <w:r>
+              <w:rPr>
+                <w:rFonts w:ascii="Calibri" w:hAnsi="Calibri"/>
+                <w:sz w:val="20"/>
+              </w:rPr>
+              <w:t>Qué indicar</w:t>
+            </w:r>
+          </w:p>
+        </w:tc>
+      </w:tr>
+      <w:tr>
+        <w:tc>
+          <w:tcPr>
+            <w:tcW w:type="dxa" w:w="4968"/>
+          </w:tcPr>
+          <w:p>
+            <w:pPr>
+              <w:spacing w:after="80"/>
+            </w:pPr>
+            <w:r>
+              <w:rPr>
+                <w:rFonts w:ascii="Calibri" w:hAnsi="Calibri"/>
+                <w:sz w:val="20"/>
+              </w:rPr>
+              <w:t>dni</w:t>
+            </w:r>
+          </w:p>
+        </w:tc>
+        <w:tc>
+          <w:tcPr>
+            <w:tcW w:type="dxa" w:w="4968"/>
+          </w:tcPr>
+          <w:p>
+            <w:pPr>
+              <w:spacing w:after="80"/>
+            </w:pPr>
+            <w:r>
+              <w:rPr>
+                <w:rFonts w:ascii="Calibri" w:hAnsi="Calibri"/>
+                <w:sz w:val="20"/>
+              </w:rPr>
+              <w:t>DNI real de ocho dígitos. Conservar ceros iniciales; no inventar ni usar 00000000.</w:t>
+            </w:r>
+          </w:p>
+        </w:tc>
+      </w:tr>
+      <w:tr>
+        <w:tc>
+          <w:tcPr>
+            <w:tcW w:type="dxa" w:w="4968"/>
+          </w:tcPr>
+          <w:p>
+            <w:pPr>
+              <w:spacing w:after="80"/>
+            </w:pPr>
+            <w:r>
+              <w:rPr>
+                <w:rFonts w:ascii="Calibri" w:hAnsi="Calibri"/>
+                <w:sz w:val="20"/>
+              </w:rPr>
+              <w:t>apellido_paterno / apellido_materno</w:t>
+            </w:r>
+          </w:p>
+        </w:tc>
+        <w:tc>
+          <w:tcPr>
+            <w:tcW w:type="dxa" w:w="4968"/>
+          </w:tcPr>
+          <w:p>
+            <w:pPr>
+              <w:spacing w:after="80"/>
+            </w:pPr>
+            <w:r>
+              <w:rPr>
+                <w:rFonts w:ascii="Calibri" w:hAnsi="Calibri"/>
+                <w:sz w:val="20"/>
+              </w:rPr>
+              <w:t>Separar y confirmar los apellidos completos conservados por el preparador.</w:t>
+            </w:r>
+          </w:p>
+        </w:tc>
+      </w:tr>
+      <w:tr>
+        <w:tc>
+          <w:tcPr>
+            <w:tcW w:type="dxa" w:w="4968"/>
+          </w:tcPr>
+          <w:p>
+            <w:pPr>
+              <w:spacing w:after="80"/>
+            </w:pPr>
+            <w:r>
+              <w:rPr>
+                <w:rFonts w:ascii="Calibri" w:hAnsi="Calibri"/>
+                <w:sz w:val="20"/>
+              </w:rPr>
+              <w:t>cargo_codigo / cargo_nombre</w:t>
+            </w:r>
+          </w:p>
+        </w:tc>
+        <w:tc>
+          <w:tcPr>
+            <w:tcW w:type="dxa" w:w="4968"/>
+          </w:tcPr>
+          <w:p>
+            <w:pPr>
+              <w:spacing w:after="80"/>
+            </w:pPr>
+            <w:r>
+              <w:rPr>
+                <w:rFonts w:ascii="Calibri" w:hAnsi="Calibri"/>
+                <w:sz w:val="20"/>
+              </w:rPr>
+              <w:t>Código de cargo de cuatro dígitos y denominación real. Si el cargo existe en destino, usar sus datos exactos.</w:t>
+            </w:r>
+          </w:p>
+        </w:tc>
+      </w:tr>
+      <w:tr>
+        <w:tc>
+          <w:tcPr>
+            <w:tcW w:type="dxa" w:w="4968"/>
+          </w:tcPr>
+          <w:p>
+            <w:pPr>
+              <w:spacing w:after="80"/>
+            </w:pPr>
+            <w:r>
+              <w:rPr>
+                <w:rFonts w:ascii="Calibri" w:hAnsi="Calibri"/>
+                <w:sz w:val="20"/>
+              </w:rPr>
+              <w:t>perfil</w:t>
+            </w:r>
+          </w:p>
+        </w:tc>
+        <w:tc>
+          <w:tcPr>
+            <w:tcW w:type="dxa" w:w="4968"/>
+          </w:tcPr>
+          <w:p>
+            <w:pPr>
+              <w:spacing w:after="80"/>
+            </w:pPr>
+            <w:r>
+              <w:rPr>
+                <w:rFonts w:ascii="Calibri" w:hAnsi="Calibri"/>
+                <w:sz w:val="20"/>
+              </w:rPr>
+              <w:t>USUARIO_AREA para permisos básicos de la propuesta; SOPORTE_UTI sólo para soporte autorizado, pues concede administrador. Revisar las opciones en area.json.</w:t>
+            </w:r>
+          </w:p>
+        </w:tc>
+      </w:tr>
+      <w:tr>
+        <w:tc>
+          <w:tcPr>
+            <w:tcW w:type="dxa" w:w="4968"/>
+          </w:tcPr>
+          <w:p>
+            <w:pPr>
+              <w:spacing w:after="80"/>
+            </w:pPr>
+            <w:r>
+              <w:rPr>
+                <w:rFonts w:ascii="Calibri" w:hAnsi="Calibri"/>
+                <w:sz w:val="20"/>
+              </w:rPr>
+              <w:t>verificado</w:t>
+            </w:r>
+          </w:p>
+        </w:tc>
+        <w:tc>
+          <w:tcPr>
+            <w:tcW w:type="dxa" w:w="4968"/>
+          </w:tcPr>
+          <w:p>
+            <w:pPr>
+              <w:spacing w:after="80"/>
+            </w:pPr>
+            <w:r>
+              <w:rPr>
+                <w:rFonts w:ascii="Calibri" w:hAnsi="Calibri"/>
+                <w:sz w:val="20"/>
+              </w:rPr>
+              <w:t>SI después de revisar esa persona; mantener 0 en incluir_sgd si no debe ingresar.</w:t>
+            </w:r>
+          </w:p>
+        </w:tc>
+      </w:tr>
+    </w:tbl>
+    <w:p>
+      <w:pPr>
+        <w:spacing w:after="140"/>
+      </w:pPr>
+      <w:r>
+        <w:rPr>
+          <w:rFonts w:ascii="Calibri" w:hAnsi="Calibri"/>
+          <w:sz w:val="21"/>
+        </w:rPr>
+        <w:t>Guardar ambos archivos. Validar sin cargar ni consultar bases:</w:t>
       </w:r>
     </w:p>
     <w:p>
@@ -811,33 +1352,7 @@
           <w:rFonts w:ascii="Consolas" w:hAnsi="Consolas"/>
           <w:sz w:val="18"/>
         </w:rPr>
-        <w:t>.\Cargar-Area.bat --catalogos</w:t>
-        <w:br/>
         <w:t>.\Cargar-Area.bat --carpeta datos\carga-uti-preparada</w:t>
-      </w:r>
-    </w:p>
-    <w:p>
-      <w:pPr>
-        <w:spacing w:after="140"/>
-      </w:pPr>
-      <w:r>
-        <w:rPr>
-          <w:rFonts w:ascii="Calibri" w:hAnsi="Calibri"/>
-          <w:sz w:val="21"/>
-        </w:rPr>
-        <w:t>Linux:</w:t>
-      </w:r>
-    </w:p>
-    <w:p>
-      <w:pPr>
-        <w:spacing w:after="140"/>
-      </w:pPr>
-      <w:r>
-        <w:rPr>
-          <w:rFonts w:ascii="Consolas" w:hAnsi="Consolas"/>
-          <w:sz w:val="18"/>
-        </w:rPr>
-        <w:t>bash Cargar-Area.sh --catalogos</w:t>
         <w:br/>
         <w:t>bash Cargar-Area.sh --carpeta datos/carga-uti-preparada</w:t>
       </w:r>
@@ -851,7 +1366,7 @@
           <w:rFonts w:ascii="Calibri" w:hAnsi="Calibri"/>
           <w:sz w:val="21"/>
         </w:rPr>
-        <w:t>Se genera un plan privado para revisión; no ejecutarlo manualmente. Esta validación no comprueba colisiones actuales en PostgreSQL. Detalle y alternativa manual: manual/CARGA-POR-AREA.md. Las 21 pruebas offline usan datos ficticios; la carga real sigue pendiente de tu ejecución. Los CSV anteriores siguen siendo compatibles; para usar el selector añadir incluir_sgd al final del encabezado y 1 o 0 al final de cada fila. Las nuevas plantillas ya lo incluyen.</w:t>
+        <w:t>Si aparece ERROR, corregir el campo señalado y repetir la validación. Si genera el plan correctamente, revisar revision.json y seguir la página siguiente para aplicar personalmente. No ejecutar plan.sql manualmente.</w:t>
       </w:r>
     </w:p>
     <w:p>
@@ -860,7 +1375,7 @@
         <w:pageBreakBefore/>
       </w:pPr>
       <w:r>
-        <w:t>12 Aplicar y retirar un área del piloto</w:t>
+        <w:t>13 Aplicar y retirar un área del piloto</w:t>
       </w:r>
     </w:p>
     <w:p>
@@ -1016,7 +1531,11 @@
         <w:spacing w:after="140"/>
       </w:pPr>
       <w:r>
-        <w:t>Al terminar arrancar la aplicación con SGD.bat iniciar o bash SGD.sh iniciar y probar personalmente accesos, permisos y el recorrido del documento. No repetir los SQL de instalación inicial. Pruebas de los nuevos utilitarios: validación offline, sintaxis SQL y PL/pgSQL y flujo de lanzadores; aún no se ejecutó una carga ni un retiro real en tus bases. La primera prueba supervisada corresponde al laboratorio.</w:t>
+        <w:rPr>
+          <w:rFonts w:ascii="Calibri" w:hAnsi="Calibri"/>
+          <w:sz w:val="21"/>
+        </w:rPr>
+        <w:t>Al terminar arrancar la aplicación con SGD.bat iniciar o bash SGD.sh iniciar y probar personalmente accesos, permisos y el recorrido del documento. No repetir los SQL de instalación inicial. Pasan 25 pruebas offline y 7 pruebas en PostgreSQL 17.11 temporal con datos ficticios: instalación, carga, actualización de sede, repetición, reversión y retiro protegido. Tus CSV aún no se han cargado. Esta primera etapa será sin firma obligatoria: conservar firma=false en los perfiles. La configuración actual permite emitir sin firma digital; no activa ni prueba certificados.</w:t>
       </w:r>
     </w:p>
     <w:sectPr>

</xml_diff>

<commit_message>
Corrige generacion documental e integra Tramitedoc y plantillas INIA
</commit_message>
<xml_diff>
--- a/manual/Manual-Instalacion-SGD-INIA-PG-Actualizado.docx
+++ b/manual/Manual-Instalacion-SGD-INIA-PG-Actualizado.docx
@@ -7,12 +7,12 @@
         <w:pStyle w:val="Title"/>
       </w:pPr>
       <w:r>
-        <w:t>Manual de instalación SGD INIA · PostgreSQL</w:t>
+        <w:t>Manual de instalación del SGD INIA con PostgreSQL</w:t>
       </w:r>
     </w:p>
     <w:p>
       <w:r>
-        <w:t>Edición 8 de octubre de 2026. Windows x64 y Linux x64. PostgreSQL nativo: los equipos de destino no necesitan Docker.</w:t>
+        <w:t>Edición 9 de octubre de 2026. Servidores Windows x64 y Linux x64 con PostgreSQL nativo. Incluye preparación de los puestos Windows con Tramitedoc. Los destinos no necesitan Docker.</w:t>
       </w:r>
     </w:p>
     <w:p>
@@ -30,7 +30,7 @@
     </w:p>
     <w:p>
       <w:r>
-        <w:t>El paquete incluye PostgreSQL 17.11, Java Temurin 8u504, Payara 5.2022.5, Python, Maven 3.10.0, dependencias offline, fuentes y WAR. No requiere instalar globalmente estos programas ni conectarse a Internet para la compilación inicial. Reservar 8 GB de RAM, preferiblemente 16 GB, y 15 GB de espacio inicial; documentos y respaldos necesitan espacio adicional.</w:t>
+        <w:t>El paquete incluye PostgreSQL 17.11, Java Temurin 8u504, Payara 5.2022.5, Python, Maven 3.10.0, dependencias offline, fuentes, WAR y el instalador original Tramitedoc para los puestos Windows. Los runtimes del servidor se ejecutan desde la carpeta y la compilación inicial es offline. Tramitedoc se instala en Windows y registra su protocolo. Reservar 8 GB de RAM, preferiblemente 16 GB, y 15 GB de espacio inicial; documentos y respaldos necesitan espacio adicional.</w:t>
       </w:r>
     </w:p>
     <w:p>
@@ -76,7 +76,7 @@
     </w:p>
     <w:p>
       <w:r>
-        <w:t>También se puede hacer doble clic en Instalar-SGD.bat. El lanzador conserva la ventana al terminar. Alternativa PowerShell con política limitada al proceso:</w:t>
+        <w:t>También se puede hacer doble clic en Instalar-SGD.bat. Elegir 1 para solo servidor, 2 para servidor y puesto en esta PC Windows, o 3 para solo puesto Windows. El lanzador conserva la ventana al terminar. Para instalar directamente el servidor, usar Instalar-SGD.bat servidor. Alternativa PowerShell:</w:t>
       </w:r>
     </w:p>
     <w:p>
@@ -89,12 +89,12 @@
           <w:rFonts w:ascii="Consolas" w:hAnsi="Consolas"/>
           <w:sz w:val="18"/>
         </w:rPr>
-        <w:t>powershell -NoProfile -ExecutionPolicy Bypass -File .\SGD.ps1 todo</w:t>
+        <w:t>powershell -NoProfile -ExecutionPolicy Bypass -File .\SGD.ps1 instalar -Equipo servidor</w:t>
       </w:r>
     </w:p>
     <w:p>
       <w:r>
-        <w:t>El instalador compila ocho aplicaciones desde fuentes, inicializa PostgreSQL con initdb, arranca el motor con pg_ctl, crea la base, carga SQL en una transacción, configura Payara y JDBC, despliega y verifica los accesos. Se detiene ante el primer error y muestra el log pertinente. No necesita Docker, WSL ni una VM en el servidor destino.</w:t>
+        <w:t>Al elegir servidor, el instalador compila ocho aplicaciones, prepara PostgreSQL, carga una base nueva en una transacción, configura Payara/JDBC, despliega y verifica accesos. Al elegir servidor y puesto, primero instala o comprueba Tramitedoc y Word. Solo puesto no instala ni modifica servidor, BD ni usuarios. Un requisito ausente detiene el paso y muestra el error. Ver sección 14 para comprobar la conexión del cliente.</w:t>
       </w:r>
     </w:p>
     <w:p>
@@ -104,7 +104,7 @@
     </w:p>
     <w:p>
       <w:r>
-        <w:t>La cuenta operadora debe tener escritura en toda la carpeta. Para acceso de otros equipos, autorizar el puerto HTTP elegido en el firewall del servidor. PostgreSQL y administración escuchan localmente por defecto. No hace falta ejecutar como administrador para usar los puertos predeterminados.</w:t>
+        <w:t>La cuenta operadora necesita escritura en la carpeta. Para acceso remoto autorizar el puerto HTTP en el firewall del servidor; BD y administración escuchan localmente por defecto. Los puertos predeterminados no requieren administrador. El asistente MSI de Tramitedoc puede solicitar elevación de Windows al preparar un puesto.</w:t>
       </w:r>
     </w:p>
     <w:p>
@@ -150,7 +150,7 @@
     </w:p>
     <w:p>
       <w:r>
-        <w:t>Extraer el ZIP completo, revisar configuracion.json y ejecutar:</w:t>
+        <w:t>Extraer el ZIP completo, revisar configuracion.json y ejecutar lo siguiente. Sin argumentos se solicita elegir 1, solo servidor. También se admite bash Instalar-SGD.sh servidor. El cliente incluido es para los puestos Windows; no se ejecuta su MSI en Linux.</w:t>
       </w:r>
     </w:p>
     <w:p>
@@ -206,7 +206,7 @@
     </w:p>
     <w:p>
       <w:r>
-        <w:t>Las nueve carpetas principales son: fuentes (código editable), java (JDK de ambos sistemas), payara (servidor normal, respaldo ZIP, plantillas y driver), herramientas (Python, Maven, repositorio offline y utilidades), bd (motor nativo, tres SQL y originales), binarios (WAR generados y reserva del proveedor), datos (base, documentos y claves), logs (resultado de operaciones) y manual (esta guía y evidencias).</w:t>
+        <w:t>Las carpetas principales son fuentes (código), java (JDK), payara (servidor y JDBC), herramientas (Python/Maven), bd (PostgreSQL y SQL), binarios (WAR), cliente-windows (MSI Tramitedoc y procedencia), datos (base, documentos y claves), logs (resultados) y manual (guías y evidencias).</w:t>
       </w:r>
     </w:p>
     <w:p>
@@ -435,7 +435,7 @@
     </w:p>
     <w:p>
       <w:r>
-        <w:t>Para una instalación nueva utilizar el ZIP limpio entregado. Para generar otro ZIP tras cambios de fuentes, ejecutar SGD.bat empaquetar o bash SGD.sh empaquetar. Se crea SGD-INIA-INSTALL_PG-PORTABLE.zip junto a la carpeta, con archivo SHA256. Excluye base activa, claves, documentos, target y despliegues antiguos. El destino recompila y crea nuevas claves.</w:t>
+        <w:t>Para una instalación nueva utilizar el ZIP limpio. Después de cambiar el paquete ejecutar SGD.bat empaquetar o bash SGD.sh empaquetar. Se crea SGD-INIA-INSTALL_PG-PORTABLE.zip y SHA256. Incluye el cliente original; excluye datos, claves, Git, configuraciones privadas, target y despliegues antiguos. configuracion.json se toma del ejemplo público. Git no incluye el MSI externo: conservarlo del portable completo.</w:t>
       </w:r>
     </w:p>
     <w:p>
@@ -607,13 +607,53 @@
           <w:sz w:val="18"/>
         </w:rPr>
         <w:t>1 ubicaciones.csv</w:t>
-        <w:br/>
+      </w:r>
+    </w:p>
+    <w:p>
+      <w:pPr>
+        <w:spacing w:after="140"/>
+      </w:pPr>
+      <w:r>
+        <w:rPr>
+          <w:rFonts w:ascii="Consolas" w:hAnsi="Consolas"/>
+          <w:sz w:val="18"/>
+        </w:rPr>
         <w:t>2 oficinas.csv</w:t>
-        <w:br/>
+      </w:r>
+    </w:p>
+    <w:p>
+      <w:pPr>
+        <w:spacing w:after="140"/>
+      </w:pPr>
+      <w:r>
+        <w:rPr>
+          <w:rFonts w:ascii="Consolas" w:hAnsi="Consolas"/>
+          <w:sz w:val="18"/>
+        </w:rPr>
         <w:t>3 trabajadores.csv</w:t>
-        <w:br/>
+      </w:r>
+    </w:p>
+    <w:p>
+      <w:pPr>
+        <w:spacing w:after="140"/>
+      </w:pPr>
+      <w:r>
+        <w:rPr>
+          <w:rFonts w:ascii="Consolas" w:hAnsi="Consolas"/>
+          <w:sz w:val="18"/>
+        </w:rPr>
         <w:t>4 perfiles.csv</w:t>
-        <w:br/>
+      </w:r>
+    </w:p>
+    <w:p>
+      <w:pPr>
+        <w:spacing w:after="140"/>
+      </w:pPr>
+      <w:r>
+        <w:rPr>
+          <w:rFonts w:ascii="Consolas" w:hAnsi="Consolas"/>
+          <w:sz w:val="18"/>
+        </w:rPr>
         <w:t>5 asignaciones.csv</w:t>
       </w:r>
     </w:p>
@@ -1089,7 +1129,7 @@
           <w:rFonts w:ascii="Calibri" w:hAnsi="Calibri"/>
           <w:sz w:val="21"/>
         </w:rPr>
-        <w:t>Sede 001: la instalación nueva crea directamente el nombre y dirección reales de la sede central. En bases anteriores, Cargar-Area actualiza automáticamente sólo el registro provisional INSTALACION LOCAL INIA / PENDIENTE, activo y creado por admin, con los datos aprobados en area.json. Se aplica dentro del respaldo y la transacción de la carga; un error revierte también la sede. Otros datos incompatibles se rechazan. No cambia el código ni sus relaciones. No ejecutar un SQL previo ni reinstalar. bd/Actualizar-Sede-Piloto-PostgreSQL.sql queda sólo como alternativa manual de recuperación para la sede central en PostgreSQL.</w:t>
+        <w:t>Sede 001: las instalaciones nuevas crean los datos reales. En bases anteriores, Cargar-Area actualiza sólo INSTALACION LOCAL INIA / PENDIENTE, activo y creado por admin, con lo aprobado en area.json. Comparte respaldo y transacción: un error revierte también la sede. Conserva código y relaciones; otros datos incompatibles se rechazan. No reinstalar ni ejecutar SQL previo. Actualizar-Sede-Piloto-PostgreSQL.sql es sólo recuperación opcional.</w:t>
       </w:r>
     </w:p>
     <w:p>
@@ -1340,7 +1380,7 @@
           <w:rFonts w:ascii="Calibri" w:hAnsi="Calibri"/>
           <w:sz w:val="21"/>
         </w:rPr>
-        <w:t>Guardar ambos archivos. Validar sin cargar ni consultar bases:</w:t>
+        <w:t>Guardar ambos archivos. Validar-Carga revisa campos, selección, titular, cargos, permisos, modelo local y archivos necesarios, sin consultar bases. Windows admite doble clic:</w:t>
       </w:r>
     </w:p>
     <w:p>
@@ -1352,9 +1392,9 @@
           <w:rFonts w:ascii="Consolas" w:hAnsi="Consolas"/>
           <w:sz w:val="18"/>
         </w:rPr>
-        <w:t>.\Cargar-Area.bat --carpeta datos\carga-uti-preparada</w:t>
+        <w:t>.\Validar-Carga.bat</w:t>
         <w:br/>
-        <w:t>bash Cargar-Area.sh --carpeta datos/carga-uti-preparada</w:t>
+        <w:t>bash Validar-Carga.sh</w:t>
       </w:r>
     </w:p>
     <w:p>
@@ -1366,7 +1406,7 @@
           <w:rFonts w:ascii="Calibri" w:hAnsi="Calibri"/>
           <w:sz w:val="21"/>
         </w:rPr>
-        <w:t>Si aparece ERROR, corregir el campo señalado y repetir la validación. Si genera el plan correctamente, revisar revision.json y seguir la página siguiente para aplicar personalmente. No ejecutar plan.sql manualmente.</w:t>
+        <w:t>Continuar sólo con VALIDACION CORRECTA. Informe: datos/validacion-carga/resultado.json. Si hay ERROR, corregir el campo indicado y repetir. Para otra área añadir --carpeta RUTA. La conexión, respaldo, padre activo y colisiones actuales se comprueban al aplicar. No repetir la preparación ni ejecutar plan.sql manualmente.</w:t>
       </w:r>
     </w:p>
     <w:p>
@@ -1383,7 +1423,7 @@
         <w:spacing w:after="140"/>
       </w:pPr>
       <w:r>
-        <w:t>Primero revisar los archivos y el plan. Aplicar en mantenimiento, con PostgreSQL iniciado y usuarios fuera de la aplicación. Para una instalación completa en un mismo equipo, detener el SGD y arrancar sólo su base:</w:t>
+        <w:t>Primero obtener VALIDACION CORRECTA y revisar los archivos. Aplicar en mantenimiento, con usuarios fuera del SGD. En una instalación completa en el mismo equipo, detener el SGD y arrancar sólo PostgreSQL:</w:t>
       </w:r>
     </w:p>
     <w:p>
@@ -1422,7 +1462,7 @@
         <w:spacing w:after="140"/>
       </w:pPr>
       <w:r>
-        <w:t>Carga aprobada en Windows o Linux. Sustituir 51001 por el código de tu área:</w:t>
+        <w:t>UTI 00217 ya fue cargada y confirmada por el operador; no repetirla. Estos comandos son referencia para una carga nueva aprobada. Para otra área cambiar carpeta y código. Obtener VALIDACION CORRECTA y ejecutar uno por uno, deteniéndose ante errores.</w:t>
       </w:r>
     </w:p>
     <w:p>
@@ -1435,9 +1475,9 @@
           <w:rFonts w:ascii="Consolas" w:hAnsi="Consolas"/>
           <w:sz w:val="18"/>
         </w:rPr>
-        <w:t>.\Cargar-Area.bat --carpeta datos\carga-uti-preparada --aplicar --confirmar CARGAR:51001</w:t>
+        <w:t>.\Cargar-Area.bat --carpeta datos\carga-uti-preparada --aplicar --confirmar CARGAR:00217</w:t>
         <w:br/>
-        <w:t>bash Cargar-Area.sh --carpeta datos/carga-uti-preparada --aplicar --confirmar CARGAR:51001</w:t>
+        <w:t>bash Cargar-Area.sh --carpeta datos/carga-uti-preparada --aplicar --confirmar CARGAR:00217</w:t>
       </w:r>
     </w:p>
     <w:p>
@@ -1474,17 +1514,9 @@
           <w:rFonts w:ascii="Consolas" w:hAnsi="Consolas"/>
           <w:sz w:val="20"/>
         </w:rPr>
-        <w:t>.\Limpiar-BD.bat --area 51001</w:t>
-      </w:r>
-      <w:r>
+        <w:t>.\Limpiar-BD.bat --area 00217</w:t>
         <w:br/>
-      </w:r>
-      <w:r>
-        <w:rPr>
-          <w:rFonts w:ascii="Consolas" w:hAnsi="Consolas"/>
-          <w:sz w:val="20"/>
-        </w:rPr>
-        <w:t>bash Limpiar-BD.sh --area 51001</w:t>
+        <w:t>bash Limpiar-BD.sh --area 00217</w:t>
       </w:r>
     </w:p>
     <w:p>
@@ -1505,17 +1537,9 @@
           <w:rFonts w:ascii="Consolas" w:hAnsi="Consolas"/>
           <w:sz w:val="20"/>
         </w:rPr>
-        <w:t>.\Limpiar-BD.bat --area 51001 --aplicar --confirmar RETIRAR:51001</w:t>
-      </w:r>
-      <w:r>
+        <w:t>.\Limpiar-BD.bat --area 00217 --aplicar --confirmar RETIRAR:00217</w:t>
         <w:br/>
-      </w:r>
-      <w:r>
-        <w:rPr>
-          <w:rFonts w:ascii="Consolas" w:hAnsi="Consolas"/>
-          <w:sz w:val="20"/>
-        </w:rPr>
-        <w:t>bash Limpiar-BD.sh --area 51001 --aplicar --confirmar RETIRAR:51001</w:t>
+        <w:t>bash Limpiar-BD.sh --area 00217 --aplicar --confirmar RETIRAR:00217</w:t>
       </w:r>
     </w:p>
     <w:p>
@@ -1535,7 +1559,163 @@
           <w:rFonts w:ascii="Calibri" w:hAnsi="Calibri"/>
           <w:sz w:val="21"/>
         </w:rPr>
-        <w:t>Al terminar arrancar la aplicación con SGD.bat iniciar o bash SGD.sh iniciar y probar personalmente accesos, permisos y el recorrido del documento. No repetir los SQL de instalación inicial. Pasan 25 pruebas offline y 7 pruebas en PostgreSQL 17.11 temporal con datos ficticios: instalación, carga, actualización de sede, repetición, reversión y retiro protegido. Tus CSV aún no se han cargado. Esta primera etapa será sin firma obligatoria: conservar firma=false en los perfiles. La configuración actual permite emitir sin firma digital; no activa ni prueba certificados.</w:t>
+        <w:t>Cuando aparezca Operación terminada, ejecutar .\SGD.bat iniciar en Windows o bash SGD.sh iniciar en Linux. En el paquete completo, iniciar arranca PostgreSQL si está detenido, prepara la conexión y arranca Payara, que ejecuta el SGD. Si ya están funcionando, no duplica los servicios. No recompila, no despliega cambios, no repite la carga de usuarios ni cambia sus contraseñas. Abrir http://127.0.0.1:8085/sisdoc/login.do (o la URL configurada) y usar el usuario y clave de CLAVES-GENERADAS-PRIVADAS.json de la carga confirmada. Probar acceso y permisos. No repetir los SQL de instalación. El piloto sigue sin firma obligatoria; certificados y firma requieren pruebas propias. UTI 00217 ya fue cargada y confirmada por el operador; no repetirla. La última ejecución de utilitarios aprobó 33 pruebas offline; las 7 pruebas de PostgreSQL aislado corresponden a una ejecución anterior.</w:t>
+      </w:r>
+    </w:p>
+    <w:p>
+      <w:pPr>
+        <w:pStyle w:val="Heading1"/>
+        <w:pageBreakBefore/>
+      </w:pPr>
+      <w:r>
+        <w:rPr>
+          <w:color w:val="000000"/>
+        </w:rPr>
+        <w:t>14 Cliente Tramitedoc en los puestos Windows</w:t>
+      </w:r>
+    </w:p>
+    <w:p>
+      <w:r>
+        <w:t>Tramitedoc es la aplicación de escritorio que conecta el navegador del SGD con los archivos y programas de la PC. Permite que Generar Doc descargue y guarde el documento de trabajo, que Abrir Doc lo abra en el editor y que Cargar Doc lo envíe al repositorio. Debe instalarse en cada PC Windows que usa el navegador, aunque Payara y PostgreSQL estén en otros servidores.</w:t>
+      </w:r>
+    </w:p>
+    <w:p>
+      <w:r>
+        <w:t>wstradoc.war es el puente WebSocket alojado en Payara. No instala Tramitedoc en las estaciones. Microsoft Word es el editor indicado por el proveedor; el utilitario comprueba su ejecutable registrado, sin instalar Office ni certificar todas sus versiones. La firma digital mantiene su configuración propia y sigue opcional en el piloto.</w:t>
+      </w:r>
+    </w:p>
+    <w:p>
+      <w:r>
+        <w:t>Instalación nueva: Instalar-SGD.bat pregunta el uso del equipo. Solo servidor prepara el servidor y recuerda el requisito de los puestos; servidor y puesto prepara ambos en la misma PC Windows; solo puesto prepara el cliente sin tocar servidor ni BD. Instalar-SGD.sh prepara el servidor Linux y comprueba que el portable incluya el cliente Windows.</w:t>
+      </w:r>
+    </w:p>
+    <w:p>
+      <w:r>
+        <w:t>Para preparar estaciones adicionales o una instalación existente, ejecutar desde la carpeta completa del portable:</w:t>
+      </w:r>
+    </w:p>
+    <w:p>
+      <w:pPr>
+        <w:keepLines/>
+        <w:spacing w:line="240" w:lineRule="auto" w:before="80" w:after="180"/>
+      </w:pPr>
+      <w:r>
+        <w:rPr>
+          <w:rFonts w:ascii="Consolas" w:hAnsi="Consolas"/>
+          <w:sz w:val="18"/>
+        </w:rPr>
+        <w:t>.\Cliente-SGD.bat instalar</w:t>
+        <w:br/>
+        <w:t>.\Cliente-SGD.bat verificar</w:t>
+      </w:r>
+    </w:p>
+    <w:p>
+      <w:r>
+        <w:t>El utilitario verifica el SHA256 del MSI antes de ejecutarlo. Si el protocolo ya apunta a Tramitedoc.exe existente, conserva la instalación. Si falta, abre el asistente original. Una cancelación, error, reinicio pendiente, registro inválido o Word ausente impide declarar listo el puesto. El cliente queda instalado en Windows; el resto del SGD mantiene sus runtimes en la carpeta portable.</w:t>
+      </w:r>
+    </w:p>
+    <w:p>
+      <w:r>
+        <w:t>Usar la misma cuenta Windows que abre Chrome. Después ingresar al SGD, permitir abrir Tramitedoc y comprobar el indicador verde de conexión. Verificar que la ruta de documentos sea local a esa estación y tenga permiso de escritura. La comprobación del protocolo y Word no demuestra conexión con APPCLIENT ni prueba documentos.</w:t>
+      </w:r>
+    </w:p>
+    <w:p>
+      <w:r>
+        <w:t>En Linux, Cliente-SGD.sh informa que el cliente suministrado requiere Windows y devuelve error para evitar un resultado falso de puesto preparado. Las estaciones Windows se preparan con Cliente-SGD.bat incluso si el servidor utiliza Linux. No instalar el MSI en el servidor Linux.</w:t>
+      </w:r>
+    </w:p>
+    <w:p>
+      <w:r>
+        <w:t>Aceptación: el operador debe probar generar, abrir, cargar y reabrir un documento autorizado. Se aprobaron 18 pruebas offline de instalación del cliente y 17 escenarios JavaScript de generación. No ejecutan MSI ni documentos reales. En esta PC también se comprobó el protocolo con ejecutable existente y Word registrado; la conexión y el ciclo documental requieren su prueba en el navegador.</w:t>
+      </w:r>
+    </w:p>
+    <w:p>
+      <w:pPr/>
+      <w:r>
+        <w:rPr>
+          <w:rFonts w:ascii="Calibri" w:hAnsi="Calibri"/>
+        </w:rPr>
+        <w:t>Plantillas DOCX: la instalación nueva incorpora INFORME 003 y OFICIO 001 adaptados al modelo INIA. Para una base existente o restaurada usar el procedimiento de la sección 15. El SGD comprueba el formato antes de solicitar la descarga. Una copia local o un Word ya cargado pueden abrirse sin regenerarlo. En los nombres de archivo, las barras de las siglas se sustituyen por guiones; el contenido conserva las siglas originales.</w:t>
+      </w:r>
+    </w:p>
+    <w:p>
+      <w:pPr>
+        <w:pStyle w:val="Heading1"/>
+        <w:pageBreakBefore/>
+      </w:pPr>
+      <w:r>
+        <w:rPr>
+          <w:color w:val="000000"/>
+        </w:rPr>
+        <w:t>15 Plantillas INIA para INFORME y OFICIO</w:t>
+      </w:r>
+    </w:p>
+    <w:p>
+      <w:r>
+        <w:t>El portable incluye plantillas-docx/INFORME-INIA.docx (003) y OFICIO-INIA.docx (001), con cabecera MIDAGRI e INIA, dependencia emisora y pie institucional del modelo suministrado. INFORME contiene antecedentes, análisis, conclusiones y recomendaciones. OFICIO admite destinatarios internos y externos. Los datos del SGD completan los campos; el cuerpo queda editable en Word.</w:t>
+      </w:r>
+    </w:p>
+    <w:p>
+      <w:r>
+        <w:t>No se copiaron nombres, número, asunto, contenido, firma, QR ni código de verificación del memorando. La plantilla no afirma que el documento esté firmado. Las denominaciones anuales se toman de los parámetros del SGD; revisar su configuración institucional.</w:t>
+      </w:r>
+    </w:p>
+    <w:p>
+      <w:r>
+        <w:t>En una base nueva el instalador incorpora ambos formatos activos en la dependencia global 00000, dentro de la transacción inicial. Se conserva la selección de formatos por área. Una base restaurada mantiene las plantillas de su respaldo; para una instalación existente o restaurada sin estos formatos, usar el utilitario siguiente. No reinstalar ni repetir la carga de UTI 00217.</w:t>
+      </w:r>
+    </w:p>
+    <w:p>
+      <w:r>
+        <w:t>1. Revisar los DOCX y ejecutar una sola opción desde la raíz del paquete completo. Verifica archivos y SHA256 y genera datos/plantillas-INIA.sql sin consultar la BD:</w:t>
+      </w:r>
+    </w:p>
+    <w:p>
+      <w:pPr>
+        <w:spacing w:after="160"/>
+      </w:pPr>
+      <w:r>
+        <w:rPr>
+          <w:rFonts w:ascii="Consolas" w:hAnsi="Consolas"/>
+          <w:sz w:val="18"/>
+        </w:rPr>
+        <w:t>Windows: .\Plantillas-SGD.bat</w:t>
+        <w:br/>
+        <w:t>Linux: bash Plantillas-SGD.sh</w:t>
+      </w:r>
+    </w:p>
+    <w:p>
+      <w:r>
+        <w:t>2. Con PostgreSQL iniciado y las credenciales de esa instalación, el operador puede aplicar desde el equipo que administra la BD. Elegir una opción:</w:t>
+      </w:r>
+    </w:p>
+    <w:p>
+      <w:pPr>
+        <w:spacing w:after="160"/>
+      </w:pPr>
+      <w:r>
+        <w:rPr>
+          <w:rFonts w:ascii="Consolas" w:hAnsi="Consolas"/>
+          <w:sz w:val="18"/>
+        </w:rPr>
+        <w:t>.\Plantillas-SGD.bat --aplicar --confirmar PLANTILLAS:INIA</w:t>
+        <w:br/>
+        <w:t>bash Plantillas-SGD.sh --aplicar --confirmar PLANTILLAS:INIA</w:t>
+      </w:r>
+    </w:p>
+    <w:p>
+      <w:r>
+        <w:t>Antes de cargar, crea datos/respaldo-antes-plantillas-FECHA-ID.dump y su SHA256. Si falla el respaldo no aplica. La carga es una transacción: un formato idéntico activo no se duplica; un formato global distinto o inactivo detiene y revierte todo. Conserva los formatos por área, usuarios, expedientes y documentos. Revisar logs/plantillas-respaldo.log y plantillas-aplicar.log ante errores.</w:t>
+      </w:r>
+    </w:p>
+    <w:p>
+      <w:r>
+        <w:t>3. Para incorporar el código corregido usar Actualizar-SGD y recargar el navegador, conservando antes cualquier edición pendiente. Comprobar conexión verde de Tramitedoc y generar, abrir, cargar y reabrir un documento autorizado. No se aplicaron estas plantillas en la BD real durante su preparación.</w:t>
+      </w:r>
+    </w:p>
+    <w:p>
+      <w:r>
+        <w:t>Validación: 14 pruebas offline del utilitario, seis DOCX ficticios procesados con XDocReport y FreeMarker incluidos y una prueba PostgreSQL aislada de repetición, conservación y reversión. Se revisaron los formatos renderizados. La prueba en el navegador con Tramitedoc y Word queda a cargo del operador; Docker solo se usó en esta PC para pruebas.</w:t>
       </w:r>
     </w:p>
     <w:sectPr>
@@ -1560,7 +1740,7 @@
       <w:rPr>
         <w:sz w:val="18"/>
       </w:rPr>
-      <w:t xml:space="preserve">Windows / Linux x64 · Edición 08/10/2026                                      Página </w:t>
+      <w:t xml:space="preserve">Windows / Linux x64 · Edición 09/10/2026                                      Página </w:t>
     </w:r>
     <w:fldSimple w:instr="PAGE"/>
   </w:p>

</xml_diff>

<commit_message>
fix: corregir campos nulos al generar documentos e integrar al portable
</commit_message>
<xml_diff>
--- a/manual/Manual-Instalacion-SGD-INIA-PG-Actualizado.docx
+++ b/manual/Manual-Instalacion-SGD-INIA-PG-Actualizado.docx
@@ -1714,8 +1714,17 @@
       </w:r>
     </w:p>
     <w:p>
+      <w:pPr/>
+      <w:r>
+        <w:t>Si Generar Doc muestra ERROR y el registro indica DEPENDENCIA_TITULO nulo, ejecutar Actualizar-SGD. La cabecera usa el título configurado o el nombre de la dependencia emisora; los campos nulos se convierten en texto vacío. No modificar la BD ni repetir las cargas de plantillas o UTI. Un fallo del motor no devuelve un DOCX incompleto.</w:t>
+      </w:r>
+    </w:p>
+    <w:p>
       <w:r>
         <w:t>Validación: 14 pruebas offline del utilitario, seis DOCX ficticios procesados con XDocReport y FreeMarker incluidos y una prueba PostgreSQL aislada de repetición, conservación y reversión. Se revisaron los formatos renderizados. La prueba en el navegador con Tramitedoc y Word queda a cargo del operador; Docker solo se usó en esta PC para pruebas.</w:t>
+      </w:r>
+      <w:r>
+        <w:t xml:space="preserve"> La prueba adicional del servicio real reproduce el fallo y aprueba 287 comprobaciones con ocho DOCX ficticios y campos nulos, alternativas de cabecera y respuestas del servlet ante archivos incompletos.</w:t>
       </w:r>
     </w:p>
     <w:sectPr>

</xml_diff>

<commit_message>
fix(instalacion): incluir cliente Tramitedoc y documentar distribucion de plantillas
</commit_message>
<xml_diff>
--- a/manual/Manual-Instalacion-SGD-INIA-PG-Actualizado.docx
+++ b/manual/Manual-Instalacion-SGD-INIA-PG-Actualizado.docx
@@ -25,7 +25,7 @@
     </w:p>
     <w:p>
       <w:r>
-        <w:t>Utilizar SGD-INIA-INSTALL_PG-PORTABLE.zip para una instalación nueva. Extraer la carpeta completa en una ruta corta con permiso de escritura, por ejemplo C:\SGD\SGD-INIA-INSTALL_PG o /opt/sgd/SGD-INIA-INSTALL_PG. En Windows usar una ruta corta: las carpetas internas del servidor pueden superar el límite de rutas si se extrae dentro de varias subcarpetas. No usar OneDrive, carpetas sincronizadas ni una unidad de red para la base activa. La carpeta de trabajo de esta PC contiene datos y claves del laboratorio; el ZIP limpio los excluye.</w:t>
+        <w:t>El portable es la carpeta completa SGD-INIA-INSTALL_PG. Para una instalación nueva disponer de fuentes, utilitarios, runtimes y dependencias en una ruta corta con permiso de escritura, por ejemplo C:\SGD\SGD-INIA-INSTALL_PG o /opt/sgd/SGD-INIA-INSTALL_PG. Git distribuye las fuentes, los scripts y la documentación; los runtimes y el MSI externo se conservan aparte. No usar OneDrive, carpetas sincronizadas ni una unidad de red para la base activa. No copiar los datos ni las claves de esta PC para crear una instalación nueva.</w:t>
       </w:r>
     </w:p>
     <w:p>
@@ -150,7 +150,7 @@
     </w:p>
     <w:p>
       <w:r>
-        <w:t>Extraer el ZIP completo, revisar configuracion.json y ejecutar lo siguiente. Sin argumentos se solicita elegir 1, solo servidor. También se admite bash Instalar-SGD.sh servidor. El cliente incluido es para los puestos Windows; no se ejecuta su MSI en Linux.</w:t>
+        <w:t>Con la carpeta portable completa, revisar configuracion.json y ejecutar lo siguiente. Sin argumentos se solicita elegir 1, solo servidor. También se admite bash Instalar-SGD.sh servidor. El cliente incluido es para los puestos Windows; no se ejecuta su MSI en Linux.</w:t>
       </w:r>
     </w:p>
     <w:p>
@@ -235,7 +235,7 @@
     </w:p>
     <w:p>
       <w:r>
-        <w:t>Abrir la raíz del paquete y editar fuentes. Compilar genera los WAR en binarios; no actualiza la aplicación que está ejecutando Payara. Desplegar reemplaza las aplicaciones por esos WAR y verificar comprueba sus accesos. Conservar la base y los documentos; no repetir la instalación inicial para publicar cambios de código.</w:t>
+        <w:t>Abrir la raíz de la carpeta portable. Incorporar las fuentes, los utilitarios y la documentación actualizados del repositorio; conservar la configuración privada, los datos y los runtimes de cada destino. Compilar genera los WAR en binarios; desplegar los pone en funcionamiento y verificar comprueba accesos. Usar Actualizar-SGD para aplicar el código nuevo sin repetir la instalación ni la carga de usuarios.</w:t>
       </w:r>
     </w:p>
     <w:p>
@@ -435,7 +435,7 @@
     </w:p>
     <w:p>
       <w:r>
-        <w:t>Para una instalación nueva utilizar el ZIP limpio. Después de cambiar el paquete ejecutar SGD.bat empaquetar o bash SGD.sh empaquetar. Se crea SGD-INIA-INSTALL_PG-PORTABLE.zip y SHA256. Incluye el cliente original; excluye datos, claves, Git, configuraciones privadas, target y despliegues antiguos. configuracion.json se toma del ejemplo público. Git no incluye el MSI externo: conservarlo del portable completo.</w:t>
+        <w:t>Para instalar o mantener otro equipo, utilizar la carpeta portable completa. Las fuentes, los utilitarios y la documentación se distribuyen mediante Git; después de incorporarlos en una instalación existente, ejecutar Actualizar-SGD. Conservar sus datos, configuración privada, claves y runtimes. SGD empaquetar genera un ZIP opcional; no es un requisito de actualización. El MSI Tramitedoc y los runtimes pesados quedan fuera de Git y deben estar presentes en el destino.</w:t>
       </w:r>
     </w:p>
     <w:p>
@@ -464,7 +464,7 @@
     </w:p>
     <w:p>
       <w:r>
-        <w:t>En Linux utilizar bash SGD.sh con las mismas acciones. Conservar datos/credenciales.json, datos/respaldo-portable.dump y datos/documentos. Extraer el ZIP limpio en destino y copiar esos tres recursos a datos. Ajustar URL y puertos y ejecutar el instalador. Cuando la base está vacía y existe el dump, se restaura automáticamente y conserva usuarios y claves. Se adaptan las rutas de documentos al destino.</w:t>
+        <w:t>En Linux utilizar bash SGD.sh con las mismas acciones. Para una restauración en un destino nuevo, preparar la carpeta portable completa y conservar datos/credenciales.json, datos/respaldo-portable.dump y datos/documentos del origen. Copiar esos recursos al destino, ajustar URL y puertos y ejecutar el instalador. Si la base está vacía y existe el dump, se restaura y conserva usuarios y claves. Actualizar código en una instalación existente no requiere restaurar ni reinstalar.</w:t>
       </w:r>
     </w:p>
     <w:p>
@@ -769,6 +769,18 @@
       </w:r>
     </w:p>
     <w:p>
+      <w:pPr/>
+      <w:r>
+        <w:t>Para cargar UTI en otra instalación, enviar únicamente area.json y usuarios-verificados.csv ya revisados. Colocarlos juntos en datos/carga-uti-preparada dentro de la carpeta del SGD de destino. area.json define el área, la sede, el responsable y los perfiles; el CSV define las personas incluidas y verificadas.</w:t>
+      </w:r>
+    </w:p>
+    <w:p>
+      <w:pPr/>
+      <w:r>
+        <w:t>LEEME.txt y pendientes.csv son ayudas de revisión. cargos-piloto.csv, si se conserva, también es auxiliar: el cargador no lo lee. Los cinco CSV originales sólo se necesitan para preparar otra vez la carga. Transferir estos datos en privado; no subirlos a Git ni copiar las credenciales o claves generadas de otra instalación.</w:t>
+      </w:r>
+    </w:p>
+    <w:p>
       <w:pPr>
         <w:spacing w:after="140"/>
       </w:pPr>
@@ -840,6 +852,9 @@
           <w:sz w:val="21"/>
         </w:rPr>
         <w:t>Conservar datos en privado y fuera de Git. La preparación y las 25 pruebas offline no equivalen a una carga real ni a la aceptación del ciclo documental.</w:t>
+      </w:r>
+      <w:r>
+        <w:t xml:space="preserve"> Validación previa de los utilitarios: 33 pruebas offline; las 7 pruebas de PostgreSQL aislado corresponden a una ejecución anterior.</w:t>
       </w:r>
     </w:p>
     <w:p>
@@ -1392,9 +1407,9 @@
           <w:rFonts w:ascii="Consolas" w:hAnsi="Consolas"/>
           <w:sz w:val="18"/>
         </w:rPr>
-        <w:t>.\Validar-Carga.bat</w:t>
+        <w:t>.\Validar-Carga.bat --carpeta datos\carga-uti-preparada</w:t>
         <w:br/>
-        <w:t>bash Validar-Carga.sh</w:t>
+        <w:t>bash Validar-Carga.sh --carpeta datos/carga-uti-preparada</w:t>
       </w:r>
     </w:p>
     <w:p>
@@ -1423,7 +1438,13 @@
         <w:spacing w:after="140"/>
       </w:pPr>
       <w:r>
-        <w:t>Primero obtener VALIDACION CORRECTA y revisar los archivos. Aplicar en mantenimiento, con usuarios fuera del SGD. En una instalación completa en el mismo equipo, detener el SGD y arrancar sólo PostgreSQL:</w:t>
+        <w:t>1. Continuar sólo con VALIDACION CORRECTA en el destino y con los archivos revisados. Aplicar en mantenimiento, con usuarios fuera del SGD. UTI 00217 ya está cargada en esta PC local; la secuencia siguiente corresponde a otra instalación donde aún no está cargada.</w:t>
+      </w:r>
+    </w:p>
+    <w:p>
+      <w:pPr/>
+      <w:r>
+        <w:t>2. En una instalación completa en el mismo equipo, detener la aplicación y arrancar sólo PostgreSQL:</w:t>
       </w:r>
     </w:p>
     <w:p>
@@ -1462,7 +1483,7 @@
         <w:spacing w:after="140"/>
       </w:pPr>
       <w:r>
-        <w:t>UTI 00217 ya fue cargada y confirmada por el operador; no repetirla. Estos comandos son referencia para una carga nueva aprobada. Para otra área cambiar carpeta y código. Obtener VALIDACION CORRECTA y ejecutar uno por uno, deteniéndose ante errores.</w:t>
+        <w:t>3. Ejecutar la carga aprobada desde la raíz del SGD. Para otra área sustituir la carpeta y CARGAR:00217 por el código de su area.json. Ejecutar cada comando por separado y detenerse ante cualquier error.</w:t>
       </w:r>
     </w:p>
     <w:p>
@@ -1485,7 +1506,33 @@
         <w:spacing w:after="140"/>
       </w:pPr>
       <w:r>
-        <w:t>Antes del cambio se crea un respaldo completo y su SHA-256. La carga se aplica en una transacción y registra procedencia. Si falta la librería de cifrado, compilar primero con SGD.bat compilar o bash SGD.sh compilar. Revisar resultado.json y CLAVES-GENERADAS-PRIVADAS.json en la carpeta privada indicada; sólo las cuentas nuevas reciben esas claves. Las existentes conservan su contraseña. No distribuir claves de una ejecución fallida.</w:t>
+        <w:t>El cargador crea un respaldo completo y su SHA-256 antes de modificar la base; si falla, no continúa. La carga se aplica en una transacción. Requiere las credenciales de ese destino y la librería de cifrado compilada; si falta, ejecutar SGD.bat compilar o bash SGD.sh compilar antes de aplicar.</w:t>
+      </w:r>
+    </w:p>
+    <w:p>
+      <w:pPr/>
+      <w:r>
+        <w:t>4. Cuando indique Operación terminada, revisar resultado.json de esa ejecución y levantar el SGD:</w:t>
+      </w:r>
+    </w:p>
+    <w:p>
+      <w:pPr>
+        <w:spacing w:after="160"/>
+      </w:pPr>
+      <w:r>
+        <w:rPr>
+          <w:rFonts w:ascii="Consolas" w:hAnsi="Consolas"/>
+          <w:sz w:val="18"/>
+        </w:rPr>
+        <w:t>.\SGD.bat iniciar</w:t>
+        <w:br/>
+        <w:t>bash SGD.sh iniciar</w:t>
+      </w:r>
+    </w:p>
+    <w:p>
+      <w:pPr/>
+      <w:r>
+        <w:t>5. Abrir la URL configurada del SGD y probar el acceso y los permisos del área. Las claves de las cuentas nuevas están en CLAVES-GENERADAS-PRIVADAS.json, dentro de la carpeta de resultados indicada por esa carga confirmada. Las cuentas existentes conservan sus claves. No distribuir claves de una ejecución fallida ni usar las generadas en otra instalación.</w:t>
       </w:r>
     </w:p>
     <w:p>
@@ -1501,7 +1548,7 @@
         <w:spacing w:after="140"/>
       </w:pPr>
       <w:r>
-        <w:t>Limpiar-BD sólo retira el área seleccionada cargada con este utilitario. Primero preparar su plan sin consultar la base:</w:t>
+        <w:t>Retiro del área, sólo cuando se solicite: Limpiar-BD retira únicamente un área cargada con este utilitario. No forma parte de la carga anterior. Primero preparar su plan sin consultar la base:</w:t>
       </w:r>
     </w:p>
     <w:p>
@@ -1549,17 +1596,8 @@
       <w:r>
         <w:t>Conserva catálogos, archivos, accesos registrados y usuarios compartidos. Se bloquea si existen documentos, oficinas hijas, otros vínculos o cambios incompatibles. No vacía la base ni elimina documentos. Crea un respaldo antes del retiro y revierte la transacción ante errores. La restauración del respaldo requiere un procedimiento separado.</w:t>
       </w:r>
-    </w:p>
-    <w:p>
-      <w:pPr>
-        <w:spacing w:after="140"/>
-      </w:pPr>
       <w:r>
-        <w:rPr>
-          <w:rFonts w:ascii="Calibri" w:hAnsi="Calibri"/>
-          <w:sz w:val="21"/>
-        </w:rPr>
-        <w:t>Cuando aparezca Operación terminada, ejecutar .\SGD.bat iniciar en Windows o bash SGD.sh iniciar en Linux. En el paquete completo, iniciar arranca PostgreSQL si está detenido, prepara la conexión y arranca Payara, que ejecuta el SGD. Si ya están funcionando, no duplica los servicios. No recompila, no despliega cambios, no repite la carga de usuarios ni cambia sus contraseñas. Abrir http://127.0.0.1:8085/sisdoc/login.do (o la URL configurada) y usar el usuario y clave de CLAVES-GENERADAS-PRIVADAS.json de la carga confirmada. Probar acceso y permisos. No repetir los SQL de instalación. El piloto sigue sin firma obligatoria; certificados y firma requieren pruebas propias. UTI 00217 ya fue cargada y confirmada por el operador; no repetirla. La última ejecución de utilitarios aprobó 33 pruebas offline; las 7 pruebas de PostgreSQL aislado corresponden a una ejecución anterior.</w:t>
+        <w:t xml:space="preserve"> Tras un retiro confirmado, levantar el SGD con iniciar.</w:t>
       </w:r>
     </w:p>
     <w:p>

</xml_diff>

<commit_message>
Prepara instalacion SGD desde Git con motores, cargas y utilitarios
</commit_message>
<xml_diff>
--- a/manual/Manual-Instalacion-SGD-INIA-PG-Actualizado.docx
+++ b/manual/Manual-Instalacion-SGD-INIA-PG-Actualizado.docx
@@ -12,7 +12,7 @@
     </w:p>
     <w:p>
       <w:r>
-        <w:t>Edición 9 de octubre de 2026. Servidores Windows x64 y Linux x64 con PostgreSQL nativo. Incluye preparación de los puestos Windows con Tramitedoc. Los destinos no necesitan Docker.</w:t>
+        <w:t>Edición 10 de octubre de 2026. Servidores Windows x64 y Linux x64 con PostgreSQL nativo. Incluye preparación de los puestos Windows con Tramitedoc. Los destinos no necesitan Docker.</w:t>
       </w:r>
     </w:p>
     <w:p>
@@ -25,7 +25,7 @@
     </w:p>
     <w:p>
       <w:r>
-        <w:t>El portable es la carpeta completa SGD-INIA-INSTALL_PG. Para una instalación nueva disponer de fuentes, utilitarios, runtimes y dependencias en una ruta corta con permiso de escritura, por ejemplo C:\SGD\SGD-INIA-INSTALL_PG o /opt/sgd/SGD-INIA-INSTALL_PG. Git distribuye las fuentes, los scripts y la documentación; los runtimes y el MSI externo se conservan aparte. No usar OneDrive, carpetas sincronizadas ni una unidad de red para la base activa. No copiar los datos ni las claves de esta PC para crear una instalación nueva.</w:t>
+        <w:t>El portable es la carpeta completa SGD-INIA-INSTALL_PG. Para una instalación nueva disponer de fuentes, utilitarios, runtimes y dependencias en una ruta corta con permiso de escritura, por ejemplo C:\SGD\SGD-INIA-INSTALL_PG o /opt/sgd/SGD-INIA-INSTALL_PG. Git distribuye fuentes, motor Payara, configuración aprobada, cargas de usuarios, correcciones, utilitarios, manuales e instaladores de los clientes. Java, PostgreSQL, Python, Maven y dependencias offline también están en Git. Clonar y ejecutar Instalar-SGD; no se necesita copiar otro portable. No usar OneDrive, carpetas sincronizadas ni una unidad de red para la base activa. No copiar los datos ni las claves de esta PC para crear una instalación nueva.</w:t>
       </w:r>
     </w:p>
     <w:p>
@@ -63,13 +63,7 @@
         <w:spacing w:line="240" w:lineRule="auto" w:before="80" w:after="180"/>
       </w:pPr>
       <w:r>
-        <w:rPr>
-          <w:rFonts w:ascii="Consolas" w:hAnsi="Consolas"/>
-          <w:sz w:val="18"/>
-        </w:rPr>
         <w:t>cd C:\SGD\SGD-INIA-INSTALL_PG</w:t>
-        <w:br/>
-        <w:t>.\SGD.bat diagnosticar</w:t>
         <w:br/>
         <w:t>.\Instalar-SGD.bat</w:t>
       </w:r>
@@ -159,13 +153,7 @@
         <w:spacing w:line="240" w:lineRule="auto" w:before="80" w:after="180"/>
       </w:pPr>
       <w:r>
-        <w:rPr>
-          <w:rFonts w:ascii="Consolas" w:hAnsi="Consolas"/>
-          <w:sz w:val="18"/>
-        </w:rPr>
         <w:t>cd /opt/sgd/SGD-INIA-INSTALL_PG</w:t>
-        <w:br/>
-        <w:t>bash SGD.sh diagnosticar</w:t>
         <w:br/>
         <w:t>bash Instalar-SGD.sh</w:t>
       </w:r>
@@ -435,7 +423,7 @@
     </w:p>
     <w:p>
       <w:r>
-        <w:t>Para instalar o mantener otro equipo, utilizar la carpeta portable completa. Las fuentes, los utilitarios y la documentación se distribuyen mediante Git; después de incorporarlos en una instalación existente, ejecutar Actualizar-SGD. Conservar sus datos, configuración privada, claves y runtimes. SGD empaquetar genera un ZIP opcional; no es un requisito de actualización. El MSI Tramitedoc y los runtimes pesados quedan fuera de Git y deben estar presentes en el destino.</w:t>
+        <w:t>Para instalar o mantener otro equipo, utilizar la carpeta portable completa. Las fuentes, los utilitarios y la documentación se distribuyen mediante Git; después de incorporarlos en una instalación existente, ejecutar Actualizar-SGD. Conservar sus datos, configuración privada, claves y runtimes. SGD empaquetar genera un ZIP opcional; no es un requisito de actualización. Payara y los instaladores de clientes se conservan en Git. Java, PostgreSQL, Python, Maven y el repositorio offline también se conservan en Git. En un equipo nuevo clonar y ejecutar Instalar-SGD.</w:t>
       </w:r>
     </w:p>
     <w:p>
@@ -662,11 +650,7 @@
         <w:spacing w:after="140"/>
       </w:pPr>
       <w:r>
-        <w:rPr>
-          <w:rFonts w:ascii="Calibri" w:hAnsi="Calibri"/>
-          <w:sz w:val="21"/>
-        </w:rPr>
-        <w:t>Conservar los cinco originales, con o sin encabezados, sin claves ni hashes. datos está excluido de Git. El preparador no modifica los originales y crea el CSV preparado con encabezados e incluir_sgd. No ejecutar nuevamente los SQL de instalación inicial.</w:t>
+        <w:t>Conservar los cinco originales, con o sin encabezados, sin claves ni hashes. Las carpetas datos/exportacion-* y datos/carga-* se conservan en el repositorio privado; la base, los documentos, claves y respaldos permanecen locales. El preparador no modifica los originales y crea el CSV preparado con encabezados e incluir_sgd. No ejecutar nuevamente los SQL de instalación inicial.</w:t>
       </w:r>
     </w:p>
     <w:p>
@@ -777,7 +761,7 @@
     <w:p>
       <w:pPr/>
       <w:r>
-        <w:t>LEEME.txt y pendientes.csv son ayudas de revisión. cargos-piloto.csv, si se conserva, también es auxiliar: el cargador no lo lee. Los cinco CSV originales sólo se necesitan para preparar otra vez la carga. Transferir estos datos en privado; no subirlos a Git ni copiar las credenciales o claves generadas de otra instalación.</w:t>
+        <w:t>LEEME.txt y pendientes.csv son ayudas de revisión. cargos-piloto.csv, si se conserva, también es auxiliar: el cargador no lo lee. Los cinco CSV originales sólo se necesitan para preparar otra vez la carga. Conservar estos archivos de trabajo en el repositorio privado para repetir la carga en otros ambientes. No copiar las credenciales ni claves generadas de otra instalación.</w:t>
       </w:r>
     </w:p>
     <w:p>
@@ -847,14 +831,7 @@
         <w:spacing w:after="140"/>
       </w:pPr>
       <w:r>
-        <w:rPr>
-          <w:rFonts w:ascii="Calibri" w:hAnsi="Calibri"/>
-          <w:sz w:val="21"/>
-        </w:rPr>
-        <w:t>Conservar datos en privado y fuera de Git. La preparación y las 25 pruebas offline no equivalen a una carga real ni a la aceptación del ciclo documental.</w:t>
-      </w:r>
-      <w:r>
-        <w:t xml:space="preserve"> Validación previa de los utilitarios: 33 pruebas offline; las 7 pruebas de PostgreSQL aislado corresponden a una ejecución anterior.</w:t>
+        <w:t>Versionar las cargas y exportaciones revisadas; conservar credenciales, documentos emitidos, SQL privado y dumps fuera de Git. La preparación y las 25 pruebas offline no equivalen a una carga real ni a la aceptación del ciclo documental. Validación previa de los utilitarios: 33 pruebas offline; las 7 pruebas de PostgreSQL aislado corresponden a una ejecución anterior.</w:t>
       </w:r>
     </w:p>
     <w:p>
@@ -1548,7 +1525,7 @@
         <w:spacing w:after="140"/>
       </w:pPr>
       <w:r>
-        <w:t>Retiro del área, sólo cuando se solicite: Limpiar-BD retira únicamente un área cargada con este utilitario. No forma parte de la carga anterior. Primero preparar su plan sin consultar la base:</w:t>
+        <w:t>Retiro del área, sólo cuando se solicite: Limpiar-BD con --area retira un área cargada con este utilitario. El reinicio completo con --todo se explica en la sección 16. No forma parte de la carga anterior. Primero preparar su plan sin consultar la base:</w:t>
       </w:r>
     </w:p>
     <w:p>
@@ -1765,6 +1742,1470 @@
         <w:t xml:space="preserve"> La prueba adicional del servicio real reproduce el fallo y aprueba 287 comprobaciones con ocho DOCX ficticios y campos nulos, alternativas de cabecera y respuestas del servlet ante archivos incompletos.</w:t>
       </w:r>
     </w:p>
+    <w:p>
+      <w:pPr>
+        <w:pStyle w:val="Heading1"/>
+        <w:pageBreakBefore/>
+      </w:pPr>
+      <w:r>
+        <w:t>16 Reiniciar completamente la base del piloto</w:t>
+      </w:r>
+    </w:p>
+    <w:p>
+      <w:r>
+        <w:t>Este procedimiento elimina todos los documentos, usuarios reales y oficinas cargadas de la base local idosgd_inia. Se usa cuando el operador decidió comenzar nuevamente todo el piloto. El operador ejecuta los comandos; la revisión de fuentes o de Payara no autoriza por sí sola ese borrado.</w:t>
+      </w:r>
+    </w:p>
+    <w:p>
+      <w:r>
+        <w:t>Desde la raíz de la instalación, ejecutar uno por uno. Si cualquier comando falla, detenerse y revisar el respaldo y los logs antes de continuar:</w:t>
+      </w:r>
+    </w:p>
+    <w:p>
+      <w:pPr>
+        <w:pStyle w:val="ComandoSGD"/>
+      </w:pPr>
+      <w:r>
+        <w:t>.\Limpiar-BD.bat --todo --aplicar --confirmar REINICIAR:idosgd_inia</w:t>
+      </w:r>
+    </w:p>
+    <w:p>
+      <w:pPr>
+        <w:pStyle w:val="ComandoSGD"/>
+      </w:pPr>
+      <w:r>
+        <w:t>.\Cargar-Area.bat --carpeta datos\carga-uti-preparada --aplicar --confirmar CARGAR:00217</w:t>
+      </w:r>
+    </w:p>
+    <w:p>
+      <w:pPr>
+        <w:pStyle w:val="ComandoSGD"/>
+      </w:pPr>
+      <w:r>
+        <w:t>.\SGD.bat iniciar</w:t>
+      </w:r>
+    </w:p>
+    <w:p>
+      <w:r>
+        <w:t>Limpiar-BD detiene Payara, respalda y comprueba la base, aparta los archivos documentales anteriores y recrea la estructura y catálogos. Conserva las carpetas de carga y las credenciales de instalación. El respaldo y los documentos anteriores quedan bajo datos/reinicio-piloto-FECHA-ID. Se recrean las cuatro cuentas de laboratorio; la carga de UTI genera nuevas claves para los usuarios reales.</w:t>
+      </w:r>
+    </w:p>
+    <w:p>
+      <w:r>
+        <w:t>Usar las claves indicadas por esa nueva carga e iniciar una sesión nueva. Para otras oficinas, repetir Cargar-Area con su carpeta revisada y el código correspondiente. No ejecutar SGD todo como sustituto de la carga: puede restaurar un respaldo portable anterior.</w:t>
+      </w:r>
+    </w:p>
+    <w:p>
+      <w:r>
+        <w:t>La eliminación y recreación completas no son una única transacción. Si la instalación falla después del borrado, conservar el respaldo y recuperar o corregir antes de cargar usuarios. La creación del esquema nuevo sí se ejecuta en una transacción. El utilitario rechaza destinos distintos de idosgd_inia local, puerto 55432, modo completo.</w:t>
+      </w:r>
+    </w:p>
+    <w:p>
+      <w:r>
+        <w:t>Limpiar-BD con --area conserva su retiro protegido: se bloquea si la oficina tiene documentos o referencias. Recargar-Usuarios cambia el alcance de acceso preservando cuentas, contraseñas y documentos; no vacía la base.</w:t>
+      </w:r>
+    </w:p>
+    <w:p>
+      <w:pPr>
+        <w:pStyle w:val="Heading1"/>
+        <w:pageBreakBefore/>
+      </w:pPr>
+      <w:r>
+        <w:t>17 Limpiar los archivos regenerables de Payara</w:t>
+      </w:r>
+    </w:p>
+    <w:p>
+      <w:r>
+        <w:t>Utilitario Windows para reducir el espacio del servidor conservando módulos, configuración, certificados, driver, propiedades y aplicaciones desplegadas. Primero revisar el alcance sin borrar ni detener servicios:</w:t>
+      </w:r>
+    </w:p>
+    <w:p>
+      <w:pPr>
+        <w:pStyle w:val="ComandoSGD"/>
+      </w:pPr>
+      <w:r>
+        <w:t>.\Limpiar-Payara.bat</w:t>
+      </w:r>
+    </w:p>
+    <w:p>
+      <w:r>
+        <w:t>Para aplicar la limpieza:</w:t>
+      </w:r>
+    </w:p>
+    <w:p>
+      <w:pPr>
+        <w:pStyle w:val="ComandoSGD"/>
+      </w:pPr>
+      <w:r>
+        <w:t>.\Limpiar-Payara.bat --aplicar</w:t>
+      </w:r>
+    </w:p>
+    <w:p>
+      <w:r>
+        <w:t>Solo retira los contenidos de osgi-cache, generated, temp y logs del dominio sgd. No elimina config, domain.xml, domain.xml.bak, applications, lib, reportes ni los documentos oficiales de datos/documentos. Los temporales de trabajo y logs anteriores se eliminan; ejecutar cuando no haya elaboración o carga de documentos en curso.</w:t>
+      </w:r>
+    </w:p>
+    <w:p>
+      <w:r>
+        <w:t>Si Payara estaba activo, lo detiene antes de limpiar y lo vuelve a iniciar. Si estaba detenido, queda detenido. No administra PostgreSQL ni aplica SQL. El primer arranque reconstruye cachés y puede tardar más. Un PID residual o enlace/junction bloquea el borrado. El resultado se guarda en logs/limpieza-payara.json.</w:t>
+      </w:r>
+    </w:p>
+    <w:p>
+      <w:r>
+        <w:t>El 10 de octubre de 2026 se retiraron 146,57 MiB de archivos regenerables del piloto y se comprobaron 1.229 archivos protegidos por SHA256. Payara estaba detenido y quedó detenido. No se ejecutaron comandos PostgreSQL. Las pruebas nativas verificaron conservación de aplicaciones y documentos, modo de revisión y bloqueos por PID y junction.</w:t>
+      </w:r>
+    </w:p>
+    <w:p>
+      <w:pPr>
+        <w:pStyle w:val="Heading1"/>
+        <w:pageBreakBefore/>
+      </w:pPr>
+      <w:r>
+        <w:t>18 Archivos que se suben al repositorio privado</w:t>
+      </w:r>
+    </w:p>
+    <w:p>
+      <w:r>
+        <w:t>Se conservan fuentes, utilitarios, manuales, plantillas, motor Payara, configuración aprobada, instaladores, cargas y correcciones. Las cargas permanecen en datos/carga-*, datos/cargas y datos/exportacion-*; se incluyen CSV, area.json y archivos auxiliares de revisión. INCIDENCIAS incluye scripts, reversión, paquetes y evidencias para atender las mismas observaciones en otros ambientes.</w:t>
+      </w:r>
+    </w:p>
+    <w:p>
+      <w:r>
+        <w:t>Se excluyen documentos emitidos PDF/Word, documentos anteriores del reinicio, base física, credenciales, claves nuevas, SQL privado, dumps, logs operativos, target, output, node_modules y temporales. No se ignoran globalmente PDF o DOCX: los manuales, formatos y ejemplos de fuentes se necesitan en las instalaciones.</w:t>
+      </w:r>
+    </w:p>
+    <w:p>
+      <w:r>
+        <w:t>Payara se versiona desde payara/payara5, conservando sus bibliotecas, scripts, licencias y componentes internos. Se excluyen glassfish/domains, mq/var, ejemplos, Javadoc y fuentes auxiliares de H2. El ZIP de respaldo no se duplica en Git. La configuración aprobada del dominio se mantiene en payara/configuracion con su manifiesto y hashes.</w:t>
+      </w:r>
+    </w:p>
+    <w:p>
+      <w:r>
+        <w:t>WAR que sí se suben: binarios/proveedor/wstradoc.war, único servicio SGD sin fuentes; y los WAR internos del motor ejb-timer-service-app.war, metro/wstx-services.war, mq/lib/imqums.war, mq/lib/imqhttp.war y mq/lib/imqhttps.war. Las rutas completas están en manual/VERSIONADO.md.</w:t>
+      </w:r>
+    </w:p>
+    <w:p>
+      <w:r>
+        <w:t>WAR que no se suben: sgd.war, consulta.war, verifica.war, mpd.war, notificador.war, wsiotramite.war, mpvio.war y recursos.war, ni sus copias históricas o versiones con sufijos. Se generan al compilar. Las dependencias JAR especiales y los módulos del motor sí se conservan.</w:t>
+      </w:r>
+    </w:p>
+    <w:p>
+      <w:r>
+        <w:t>Para preparar todos los cambios sin dejar fuentes pendientes:</w:t>
+      </w:r>
+    </w:p>
+    <w:p>
+      <w:pPr>
+        <w:pStyle w:val="ComandoSGD"/>
+      </w:pPr>
+      <w:r>
+        <w:t>git add .</w:t>
+        <w:br/>
+        <w:t>git diff --cached --check</w:t>
+        <w:br/>
+        <w:t>git diff --cached --stat</w:t>
+      </w:r>
+    </w:p>
+    <w:p>
+      <w:r>
+        <w:t>Revisar el índice antes del commit y del push. Las reglas de Git no borran archivos locales ni retiran archivos que ya estaban registrados. El repositorio no reemplaza los respaldos de PostgreSQL y documentos. Los acuerdos de continuidad están en AGENTS.md.</w:t>
+      </w:r>
+    </w:p>
+    <w:p>
+      <w:pPr>
+        <w:pStyle w:val="Heading1"/>
+        <w:pageBreakBefore/>
+      </w:pPr>
+      <w:r>
+        <w:t>19 Resumen para instalar o reemplazar fuentes</w:t>
+      </w:r>
+    </w:p>
+    <w:p>
+      <w:r>
+        <w:t>1. Clonar la rama base-sgd-inia en una instalación nueva. Git incluye los motores y dependencias necesarios. En instalaciones existentes incorporar el commit conservando datos y configuración local.</w:t>
+      </w:r>
+    </w:p>
+    <w:p>
+      <w:r>
+        <w:t>2. Instalar-SGD crea configuracion.json desde el ejemplo si falta, con heap_payara_mb=4096. Para personalizar IP o puertos antes de instalar, copiar y editar el ejemplo. No copia datos ni claves de otra máquina.</w:t>
+      </w:r>
+    </w:p>
+    <w:p>
+      <w:r>
+        <w:t>3. Para una instalación nueva usar Instalar-SGD.bat servidor. El instalador crea un dominio nuevo, compila los ocho WAR propios y despliega los servicios. Para una existente usar Actualizar-SGD.bat y verificar; no reiniciar su base.</w:t>
+      </w:r>
+    </w:p>
+    <w:p>
+      <w:r>
+        <w:t>4. Validar cada carpeta de carga y aplicar Cargar-Area con el código correcto. Usar las claves generadas en ese ambiente. No volver a cargar una oficina ya cargada salvo el procedimiento explícito de reinicio o actualización.</w:t>
+      </w:r>
+    </w:p>
+    <w:p>
+      <w:r>
+        <w:t>5. Revisar las incidencias pendientes y ejecutar solo las correcciones que correspondan al estado del ambiente. Subir los scripts no los aplica automáticamente.</w:t>
+      </w:r>
+    </w:p>
+    <w:p>
+      <w:r>
+        <w:t>6. Abrir una sesión nueva y probar permisos, generación, apertura, carga y firma según el flujo institucional. Compilar por sí solo no despliega los cambios.</w:t>
+      </w:r>
+    </w:p>
+    <w:p>
+      <w:r>
+        <w:t>7. Para preparar otra entrega usar .gitignore, git add . y revisar el contenido antes de publicar. No ejecutar limpieza física por preparar una subida: los archivos locales se conservan.</w:t>
+      </w:r>
+    </w:p>
+    <w:p>
+      <w:r>
+        <w:t>La copia payara/configuracion puede contener referencias a aplicaciones del piloto. Sirve para conservar y comparar los ajustes y para su restauración administrada. En una instalación nueva seguir el instalador; no reemplazar ciegamente el dominio recién creado con la captura de otro ambiente.</w:t>
+      </w:r>
+    </w:p>
+    <w:p>
+      <w:pPr>
+        <w:pStyle w:val="Heading1"/>
+        <w:pageBreakBefore/>
+      </w:pPr>
+      <w:r>
+        <w:t>20 Utilitarios y cuándo usarlos</w:t>
+      </w:r>
+    </w:p>
+    <w:tbl>
+      <w:tblPr>
+        <w:tblW w:type="auto" w:w="0"/>
+        <w:jc w:val="center"/>
+        <w:tblLayout w:type="fixed"/>
+        <w:tblLook w:firstColumn="1" w:firstRow="1" w:lastColumn="0" w:lastRow="0" w:noHBand="0" w:noVBand="1" w:val="04A0"/>
+      </w:tblPr>
+      <w:tblGrid>
+        <w:gridCol w:w="3024"/>
+        <w:gridCol w:w="6336"/>
+      </w:tblGrid>
+      <w:tr>
+        <w:trPr>
+          <w:tblHeader/>
+          <w:cantSplit/>
+          <w:cantSplit/>
+        </w:trPr>
+        <w:tc>
+          <w:tcPr>
+            <w:tcW w:type="dxa" w:w="3024"/>
+            <w:vAlign w:val="center"/>
+            <w:tcBorders>
+              <w:top w:val="single" w:sz="4" w:color="D9D9D9"/>
+              <w:left w:val="single" w:sz="4" w:color="D9D9D9"/>
+              <w:bottom w:val="single" w:sz="4" w:color="D9D9D9"/>
+              <w:right w:val="single" w:sz="4" w:color="D9D9D9"/>
+            </w:tcBorders>
+            <w:tcMar>
+              <w:top w:w="60" w:type="dxa"/>
+              <w:left w:w="100" w:type="dxa"/>
+              <w:bottom w:w="60" w:type="dxa"/>
+              <w:right w:w="100" w:type="dxa"/>
+            </w:tcMar>
+            <w:shd w:fill="243746"/>
+          </w:tcPr>
+          <w:p>
+            <w:pPr>
+              <w:keepNext w:val="0"/>
+              <w:spacing w:before="0" w:after="20" w:line="252" w:lineRule="auto"/>
+            </w:pPr>
+            <w:r>
+              <w:rPr>
+                <w:b/>
+                <w:color w:val="FFFFFF"/>
+                <w:sz w:val="21"/>
+              </w:rPr>
+              <w:t>Utilitario</w:t>
+            </w:r>
+          </w:p>
+        </w:tc>
+        <w:tc>
+          <w:tcPr>
+            <w:tcW w:type="dxa" w:w="6336"/>
+            <w:vAlign w:val="center"/>
+            <w:tcBorders>
+              <w:top w:val="single" w:sz="4" w:color="D9D9D9"/>
+              <w:left w:val="single" w:sz="4" w:color="D9D9D9"/>
+              <w:bottom w:val="single" w:sz="4" w:color="D9D9D9"/>
+              <w:right w:val="single" w:sz="4" w:color="D9D9D9"/>
+            </w:tcBorders>
+            <w:tcMar>
+              <w:top w:w="60" w:type="dxa"/>
+              <w:left w:w="100" w:type="dxa"/>
+              <w:bottom w:w="60" w:type="dxa"/>
+              <w:right w:w="100" w:type="dxa"/>
+            </w:tcMar>
+            <w:shd w:fill="243746"/>
+          </w:tcPr>
+          <w:p>
+            <w:pPr>
+              <w:keepNext w:val="0"/>
+              <w:spacing w:before="0" w:after="20" w:line="252" w:lineRule="auto"/>
+            </w:pPr>
+            <w:r>
+              <w:rPr>
+                <w:b/>
+                <w:color w:val="FFFFFF"/>
+                <w:sz w:val="21"/>
+              </w:rPr>
+              <w:t>Uso y momento</w:t>
+            </w:r>
+          </w:p>
+        </w:tc>
+      </w:tr>
+      <w:tr>
+        <w:trPr>
+          <w:cantSplit/>
+          <w:cantSplit/>
+        </w:trPr>
+        <w:tc>
+          <w:tcPr>
+            <w:tcW w:type="dxa" w:w="3024"/>
+            <w:vAlign w:val="center"/>
+            <w:tcBorders>
+              <w:top w:val="single" w:sz="4" w:color="D9D9D9"/>
+              <w:left w:val="single" w:sz="4" w:color="D9D9D9"/>
+              <w:bottom w:val="single" w:sz="4" w:color="D9D9D9"/>
+              <w:right w:val="single" w:sz="4" w:color="D9D9D9"/>
+            </w:tcBorders>
+            <w:tcMar>
+              <w:top w:w="60" w:type="dxa"/>
+              <w:left w:w="100" w:type="dxa"/>
+              <w:bottom w:w="60" w:type="dxa"/>
+              <w:right w:w="100" w:type="dxa"/>
+            </w:tcMar>
+            <w:shd w:fill="FFFFFF"/>
+          </w:tcPr>
+          <w:p>
+            <w:pPr>
+              <w:keepNext w:val="0"/>
+              <w:spacing w:before="0" w:after="20" w:line="252" w:lineRule="auto"/>
+            </w:pPr>
+            <w:r>
+              <w:rPr>
+                <w:b w:val="0"/>
+                <w:color w:val="000000"/>
+                <w:sz w:val="21"/>
+              </w:rPr>
+              <w:t>Instalar-SGD</w:t>
+            </w:r>
+          </w:p>
+        </w:tc>
+        <w:tc>
+          <w:tcPr>
+            <w:tcW w:type="dxa" w:w="6336"/>
+            <w:vAlign w:val="center"/>
+            <w:tcBorders>
+              <w:top w:val="single" w:sz="4" w:color="D9D9D9"/>
+              <w:left w:val="single" w:sz="4" w:color="D9D9D9"/>
+              <w:bottom w:val="single" w:sz="4" w:color="D9D9D9"/>
+              <w:right w:val="single" w:sz="4" w:color="D9D9D9"/>
+            </w:tcBorders>
+            <w:tcMar>
+              <w:top w:w="60" w:type="dxa"/>
+              <w:left w:w="100" w:type="dxa"/>
+              <w:bottom w:w="60" w:type="dxa"/>
+              <w:right w:w="100" w:type="dxa"/>
+            </w:tcMar>
+            <w:shd w:fill="FFFFFF"/>
+          </w:tcPr>
+          <w:p>
+            <w:pPr>
+              <w:keepNext w:val="0"/>
+              <w:spacing w:before="0" w:after="20" w:line="252" w:lineRule="auto"/>
+            </w:pPr>
+            <w:r>
+              <w:rPr>
+                <w:b w:val="0"/>
+                <w:color w:val="000000"/>
+                <w:sz w:val="21"/>
+              </w:rPr>
+              <w:t>Crear una instalación nueva. Elegir servidor, completo o puesto según el equipo.</w:t>
+            </w:r>
+          </w:p>
+        </w:tc>
+      </w:tr>
+      <w:tr>
+        <w:trPr>
+          <w:cantSplit/>
+          <w:cantSplit/>
+        </w:trPr>
+        <w:tc>
+          <w:tcPr>
+            <w:tcW w:type="dxa" w:w="3024"/>
+            <w:vAlign w:val="center"/>
+            <w:tcBorders>
+              <w:top w:val="single" w:sz="4" w:color="D9D9D9"/>
+              <w:left w:val="single" w:sz="4" w:color="D9D9D9"/>
+              <w:bottom w:val="single" w:sz="4" w:color="D9D9D9"/>
+              <w:right w:val="single" w:sz="4" w:color="D9D9D9"/>
+            </w:tcBorders>
+            <w:tcMar>
+              <w:top w:w="60" w:type="dxa"/>
+              <w:left w:w="100" w:type="dxa"/>
+              <w:bottom w:w="60" w:type="dxa"/>
+              <w:right w:w="100" w:type="dxa"/>
+            </w:tcMar>
+            <w:shd w:fill="F3F6F8"/>
+          </w:tcPr>
+          <w:p>
+            <w:pPr>
+              <w:keepNext w:val="0"/>
+              <w:spacing w:before="0" w:after="20" w:line="252" w:lineRule="auto"/>
+            </w:pPr>
+            <w:r>
+              <w:rPr>
+                <w:b w:val="0"/>
+                <w:color w:val="000000"/>
+                <w:sz w:val="21"/>
+              </w:rPr>
+              <w:t>Actualizar-SGD</w:t>
+            </w:r>
+          </w:p>
+        </w:tc>
+        <w:tc>
+          <w:tcPr>
+            <w:tcW w:type="dxa" w:w="6336"/>
+            <w:vAlign w:val="center"/>
+            <w:tcBorders>
+              <w:top w:val="single" w:sz="4" w:color="D9D9D9"/>
+              <w:left w:val="single" w:sz="4" w:color="D9D9D9"/>
+              <w:bottom w:val="single" w:sz="4" w:color="D9D9D9"/>
+              <w:right w:val="single" w:sz="4" w:color="D9D9D9"/>
+            </w:tcBorders>
+            <w:tcMar>
+              <w:top w:w="60" w:type="dxa"/>
+              <w:left w:w="100" w:type="dxa"/>
+              <w:bottom w:w="60" w:type="dxa"/>
+              <w:right w:w="100" w:type="dxa"/>
+            </w:tcMar>
+            <w:shd w:fill="F3F6F8"/>
+          </w:tcPr>
+          <w:p>
+            <w:pPr>
+              <w:keepNext w:val="0"/>
+              <w:spacing w:before="0" w:after="20" w:line="252" w:lineRule="auto"/>
+            </w:pPr>
+            <w:r>
+              <w:rPr>
+                <w:b w:val="0"/>
+                <w:color w:val="000000"/>
+                <w:sz w:val="21"/>
+              </w:rPr>
+              <w:t>Incorporar fuentes nuevas, compilar, desplegar y verificar una instalación existente.</w:t>
+            </w:r>
+          </w:p>
+        </w:tc>
+      </w:tr>
+      <w:tr>
+        <w:trPr>
+          <w:cantSplit/>
+          <w:cantSplit/>
+        </w:trPr>
+        <w:tc>
+          <w:tcPr>
+            <w:tcW w:type="dxa" w:w="3024"/>
+            <w:vAlign w:val="center"/>
+            <w:tcBorders>
+              <w:top w:val="single" w:sz="4" w:color="D9D9D9"/>
+              <w:left w:val="single" w:sz="4" w:color="D9D9D9"/>
+              <w:bottom w:val="single" w:sz="4" w:color="D9D9D9"/>
+              <w:right w:val="single" w:sz="4" w:color="D9D9D9"/>
+            </w:tcBorders>
+            <w:tcMar>
+              <w:top w:w="60" w:type="dxa"/>
+              <w:left w:w="100" w:type="dxa"/>
+              <w:bottom w:w="60" w:type="dxa"/>
+              <w:right w:w="100" w:type="dxa"/>
+            </w:tcMar>
+            <w:shd w:fill="FFFFFF"/>
+          </w:tcPr>
+          <w:p>
+            <w:pPr>
+              <w:keepNext w:val="0"/>
+              <w:spacing w:before="0" w:after="20" w:line="252" w:lineRule="auto"/>
+            </w:pPr>
+            <w:r>
+              <w:rPr>
+                <w:b w:val="0"/>
+                <w:color w:val="000000"/>
+                <w:sz w:val="21"/>
+              </w:rPr>
+              <w:t>SGD</w:t>
+            </w:r>
+          </w:p>
+        </w:tc>
+        <w:tc>
+          <w:tcPr>
+            <w:tcW w:type="dxa" w:w="6336"/>
+            <w:vAlign w:val="center"/>
+            <w:tcBorders>
+              <w:top w:val="single" w:sz="4" w:color="D9D9D9"/>
+              <w:left w:val="single" w:sz="4" w:color="D9D9D9"/>
+              <w:bottom w:val="single" w:sz="4" w:color="D9D9D9"/>
+              <w:right w:val="single" w:sz="4" w:color="D9D9D9"/>
+            </w:tcBorders>
+            <w:tcMar>
+              <w:top w:w="60" w:type="dxa"/>
+              <w:left w:w="100" w:type="dxa"/>
+              <w:bottom w:w="60" w:type="dxa"/>
+              <w:right w:w="100" w:type="dxa"/>
+            </w:tcMar>
+            <w:shd w:fill="FFFFFF"/>
+          </w:tcPr>
+          <w:p>
+            <w:pPr>
+              <w:keepNext w:val="0"/>
+              <w:spacing w:before="0" w:after="20" w:line="252" w:lineRule="auto"/>
+            </w:pPr>
+            <w:r>
+              <w:rPr>
+                <w:b w:val="0"/>
+                <w:color w:val="000000"/>
+                <w:sz w:val="21"/>
+              </w:rPr>
+              <w:t>Acciones específicas: compilar, desplegar, verificar, configurar, base, datos, respaldar y restaurar. Revisar el alcance antes de acciones de base.</w:t>
+            </w:r>
+          </w:p>
+        </w:tc>
+      </w:tr>
+      <w:tr>
+        <w:trPr>
+          <w:cantSplit/>
+          <w:cantSplit/>
+        </w:trPr>
+        <w:tc>
+          <w:tcPr>
+            <w:tcW w:type="dxa" w:w="3024"/>
+            <w:vAlign w:val="center"/>
+            <w:tcBorders>
+              <w:top w:val="single" w:sz="4" w:color="D9D9D9"/>
+              <w:left w:val="single" w:sz="4" w:color="D9D9D9"/>
+              <w:bottom w:val="single" w:sz="4" w:color="D9D9D9"/>
+              <w:right w:val="single" w:sz="4" w:color="D9D9D9"/>
+            </w:tcBorders>
+            <w:tcMar>
+              <w:top w:w="60" w:type="dxa"/>
+              <w:left w:w="100" w:type="dxa"/>
+              <w:bottom w:w="60" w:type="dxa"/>
+              <w:right w:w="100" w:type="dxa"/>
+            </w:tcMar>
+            <w:shd w:fill="F3F6F8"/>
+          </w:tcPr>
+          <w:p>
+            <w:pPr>
+              <w:keepNext w:val="0"/>
+              <w:spacing w:before="0" w:after="20" w:line="252" w:lineRule="auto"/>
+            </w:pPr>
+            <w:r>
+              <w:rPr>
+                <w:b w:val="0"/>
+                <w:color w:val="000000"/>
+                <w:sz w:val="21"/>
+              </w:rPr>
+              <w:t>Iniciar-SGD / Detener-SGD</w:t>
+            </w:r>
+          </w:p>
+        </w:tc>
+        <w:tc>
+          <w:tcPr>
+            <w:tcW w:type="dxa" w:w="6336"/>
+            <w:vAlign w:val="center"/>
+            <w:tcBorders>
+              <w:top w:val="single" w:sz="4" w:color="D9D9D9"/>
+              <w:left w:val="single" w:sz="4" w:color="D9D9D9"/>
+              <w:bottom w:val="single" w:sz="4" w:color="D9D9D9"/>
+              <w:right w:val="single" w:sz="4" w:color="D9D9D9"/>
+            </w:tcBorders>
+            <w:tcMar>
+              <w:top w:w="60" w:type="dxa"/>
+              <w:left w:w="100" w:type="dxa"/>
+              <w:bottom w:w="60" w:type="dxa"/>
+              <w:right w:w="100" w:type="dxa"/>
+            </w:tcMar>
+            <w:shd w:fill="F3F6F8"/>
+          </w:tcPr>
+          <w:p>
+            <w:pPr>
+              <w:keepNext w:val="0"/>
+              <w:spacing w:before="0" w:after="20" w:line="252" w:lineRule="auto"/>
+            </w:pPr>
+            <w:r>
+              <w:rPr>
+                <w:b w:val="0"/>
+                <w:color w:val="000000"/>
+                <w:sz w:val="21"/>
+              </w:rPr>
+              <w:t>Arrancar o detener los servicios del equipo. Detener-SGD también detiene PostgreSQL en modo completo.</w:t>
+            </w:r>
+          </w:p>
+        </w:tc>
+      </w:tr>
+      <w:tr>
+        <w:trPr>
+          <w:cantSplit/>
+          <w:cantSplit/>
+        </w:trPr>
+        <w:tc>
+          <w:tcPr>
+            <w:tcW w:type="dxa" w:w="3024"/>
+            <w:vAlign w:val="center"/>
+            <w:tcBorders>
+              <w:top w:val="single" w:sz="4" w:color="D9D9D9"/>
+              <w:left w:val="single" w:sz="4" w:color="D9D9D9"/>
+              <w:bottom w:val="single" w:sz="4" w:color="D9D9D9"/>
+              <w:right w:val="single" w:sz="4" w:color="D9D9D9"/>
+            </w:tcBorders>
+            <w:tcMar>
+              <w:top w:w="60" w:type="dxa"/>
+              <w:left w:w="100" w:type="dxa"/>
+              <w:bottom w:w="60" w:type="dxa"/>
+              <w:right w:w="100" w:type="dxa"/>
+            </w:tcMar>
+            <w:shd w:fill="FFFFFF"/>
+          </w:tcPr>
+          <w:p>
+            <w:pPr>
+              <w:keepNext w:val="0"/>
+              <w:spacing w:before="0" w:after="20" w:line="252" w:lineRule="auto"/>
+            </w:pPr>
+            <w:r>
+              <w:rPr>
+                <w:b w:val="0"/>
+                <w:color w:val="000000"/>
+                <w:sz w:val="21"/>
+              </w:rPr>
+              <w:t>Cliente-SGD</w:t>
+            </w:r>
+          </w:p>
+        </w:tc>
+        <w:tc>
+          <w:tcPr>
+            <w:tcW w:type="dxa" w:w="6336"/>
+            <w:vAlign w:val="center"/>
+            <w:tcBorders>
+              <w:top w:val="single" w:sz="4" w:color="D9D9D9"/>
+              <w:left w:val="single" w:sz="4" w:color="D9D9D9"/>
+              <w:bottom w:val="single" w:sz="4" w:color="D9D9D9"/>
+              <w:right w:val="single" w:sz="4" w:color="D9D9D9"/>
+            </w:tcBorders>
+            <w:tcMar>
+              <w:top w:w="60" w:type="dxa"/>
+              <w:left w:w="100" w:type="dxa"/>
+              <w:bottom w:w="60" w:type="dxa"/>
+              <w:right w:w="100" w:type="dxa"/>
+            </w:tcMar>
+            <w:shd w:fill="FFFFFF"/>
+          </w:tcPr>
+          <w:p>
+            <w:pPr>
+              <w:keepNext w:val="0"/>
+              <w:spacing w:before="0" w:after="20" w:line="252" w:lineRule="auto"/>
+            </w:pPr>
+            <w:r>
+              <w:rPr>
+                <w:b w:val="0"/>
+                <w:color w:val="000000"/>
+                <w:sz w:val="21"/>
+              </w:rPr>
+              <w:t>Instalar o comprobar Tramitedoc y Word en la estación Windows del navegador.</w:t>
+            </w:r>
+          </w:p>
+        </w:tc>
+      </w:tr>
+      <w:tr>
+        <w:trPr>
+          <w:cantSplit/>
+          <w:cantSplit/>
+        </w:trPr>
+        <w:tc>
+          <w:tcPr>
+            <w:tcW w:type="dxa" w:w="3024"/>
+            <w:vAlign w:val="center"/>
+            <w:tcBorders>
+              <w:top w:val="single" w:sz="4" w:color="D9D9D9"/>
+              <w:left w:val="single" w:sz="4" w:color="D9D9D9"/>
+              <w:bottom w:val="single" w:sz="4" w:color="D9D9D9"/>
+              <w:right w:val="single" w:sz="4" w:color="D9D9D9"/>
+            </w:tcBorders>
+            <w:tcMar>
+              <w:top w:w="60" w:type="dxa"/>
+              <w:left w:w="100" w:type="dxa"/>
+              <w:bottom w:w="60" w:type="dxa"/>
+              <w:right w:w="100" w:type="dxa"/>
+            </w:tcMar>
+            <w:shd w:fill="F3F6F8"/>
+          </w:tcPr>
+          <w:p>
+            <w:pPr>
+              <w:keepNext w:val="0"/>
+              <w:spacing w:before="0" w:after="20" w:line="252" w:lineRule="auto"/>
+            </w:pPr>
+            <w:r>
+              <w:rPr>
+                <w:b w:val="0"/>
+                <w:color w:val="000000"/>
+                <w:sz w:val="21"/>
+              </w:rPr>
+              <w:t>Preparar-Carga</w:t>
+            </w:r>
+          </w:p>
+        </w:tc>
+        <w:tc>
+          <w:tcPr>
+            <w:tcW w:type="dxa" w:w="6336"/>
+            <w:vAlign w:val="center"/>
+            <w:tcBorders>
+              <w:top w:val="single" w:sz="4" w:color="D9D9D9"/>
+              <w:left w:val="single" w:sz="4" w:color="D9D9D9"/>
+              <w:bottom w:val="single" w:sz="4" w:color="D9D9D9"/>
+              <w:right w:val="single" w:sz="4" w:color="D9D9D9"/>
+            </w:tcBorders>
+            <w:tcMar>
+              <w:top w:w="60" w:type="dxa"/>
+              <w:left w:w="100" w:type="dxa"/>
+              <w:bottom w:w="60" w:type="dxa"/>
+              <w:right w:w="100" w:type="dxa"/>
+            </w:tcMar>
+            <w:shd w:fill="F3F6F8"/>
+          </w:tcPr>
+          <w:p>
+            <w:pPr>
+              <w:keepNext w:val="0"/>
+              <w:spacing w:before="0" w:after="20" w:line="252" w:lineRule="auto"/>
+            </w:pPr>
+            <w:r>
+              <w:rPr>
+                <w:b w:val="0"/>
+                <w:color w:val="000000"/>
+                <w:sz w:val="21"/>
+              </w:rPr>
+              <w:t>Convertir los cinco CSV exportados a una carga pendiente de revisión; no consulta la base.</w:t>
+            </w:r>
+          </w:p>
+        </w:tc>
+      </w:tr>
+      <w:tr>
+        <w:trPr>
+          <w:cantSplit/>
+          <w:cantSplit/>
+        </w:trPr>
+        <w:tc>
+          <w:tcPr>
+            <w:tcW w:type="dxa" w:w="3024"/>
+            <w:vAlign w:val="center"/>
+            <w:tcBorders>
+              <w:top w:val="single" w:sz="4" w:color="D9D9D9"/>
+              <w:left w:val="single" w:sz="4" w:color="D9D9D9"/>
+              <w:bottom w:val="single" w:sz="4" w:color="D9D9D9"/>
+              <w:right w:val="single" w:sz="4" w:color="D9D9D9"/>
+            </w:tcBorders>
+            <w:tcMar>
+              <w:top w:w="60" w:type="dxa"/>
+              <w:left w:w="100" w:type="dxa"/>
+              <w:bottom w:w="60" w:type="dxa"/>
+              <w:right w:w="100" w:type="dxa"/>
+            </w:tcMar>
+            <w:shd w:fill="FFFFFF"/>
+          </w:tcPr>
+          <w:p>
+            <w:pPr>
+              <w:keepNext w:val="0"/>
+              <w:spacing w:before="0" w:after="20" w:line="252" w:lineRule="auto"/>
+            </w:pPr>
+            <w:r>
+              <w:rPr>
+                <w:b w:val="0"/>
+                <w:color w:val="000000"/>
+                <w:sz w:val="21"/>
+              </w:rPr>
+              <w:t>Validar-Carga</w:t>
+            </w:r>
+          </w:p>
+        </w:tc>
+        <w:tc>
+          <w:tcPr>
+            <w:tcW w:type="dxa" w:w="6336"/>
+            <w:vAlign w:val="center"/>
+            <w:tcBorders>
+              <w:top w:val="single" w:sz="4" w:color="D9D9D9"/>
+              <w:left w:val="single" w:sz="4" w:color="D9D9D9"/>
+              <w:bottom w:val="single" w:sz="4" w:color="D9D9D9"/>
+              <w:right w:val="single" w:sz="4" w:color="D9D9D9"/>
+            </w:tcBorders>
+            <w:tcMar>
+              <w:top w:w="60" w:type="dxa"/>
+              <w:left w:w="100" w:type="dxa"/>
+              <w:bottom w:w="60" w:type="dxa"/>
+              <w:right w:w="100" w:type="dxa"/>
+            </w:tcMar>
+            <w:shd w:fill="FFFFFF"/>
+          </w:tcPr>
+          <w:p>
+            <w:pPr>
+              <w:keepNext w:val="0"/>
+              <w:spacing w:before="0" w:after="20" w:line="252" w:lineRule="auto"/>
+            </w:pPr>
+            <w:r>
+              <w:rPr>
+                <w:b w:val="0"/>
+                <w:color w:val="000000"/>
+                <w:sz w:val="21"/>
+              </w:rPr>
+              <w:t>Comprobar los archivos revisados antes de cargar; no consulta la base.</w:t>
+            </w:r>
+          </w:p>
+        </w:tc>
+      </w:tr>
+      <w:tr>
+        <w:trPr>
+          <w:cantSplit/>
+          <w:cantSplit/>
+        </w:trPr>
+        <w:tc>
+          <w:tcPr>
+            <w:tcW w:type="dxa" w:w="3024"/>
+            <w:vAlign w:val="center"/>
+            <w:tcBorders>
+              <w:top w:val="single" w:sz="4" w:color="D9D9D9"/>
+              <w:left w:val="single" w:sz="4" w:color="D9D9D9"/>
+              <w:bottom w:val="single" w:sz="4" w:color="D9D9D9"/>
+              <w:right w:val="single" w:sz="4" w:color="D9D9D9"/>
+            </w:tcBorders>
+            <w:tcMar>
+              <w:top w:w="60" w:type="dxa"/>
+              <w:left w:w="100" w:type="dxa"/>
+              <w:bottom w:w="60" w:type="dxa"/>
+              <w:right w:w="100" w:type="dxa"/>
+            </w:tcMar>
+            <w:shd w:fill="F3F6F8"/>
+          </w:tcPr>
+          <w:p>
+            <w:pPr>
+              <w:keepNext w:val="0"/>
+              <w:spacing w:before="0" w:after="20" w:line="252" w:lineRule="auto"/>
+            </w:pPr>
+            <w:r>
+              <w:rPr>
+                <w:b w:val="0"/>
+                <w:color w:val="000000"/>
+                <w:sz w:val="21"/>
+              </w:rPr>
+              <w:t>Cargar-Area</w:t>
+            </w:r>
+          </w:p>
+        </w:tc>
+        <w:tc>
+          <w:tcPr>
+            <w:tcW w:type="dxa" w:w="6336"/>
+            <w:vAlign w:val="center"/>
+            <w:tcBorders>
+              <w:top w:val="single" w:sz="4" w:color="D9D9D9"/>
+              <w:left w:val="single" w:sz="4" w:color="D9D9D9"/>
+              <w:bottom w:val="single" w:sz="4" w:color="D9D9D9"/>
+              <w:right w:val="single" w:sz="4" w:color="D9D9D9"/>
+            </w:tcBorders>
+            <w:tcMar>
+              <w:top w:w="60" w:type="dxa"/>
+              <w:left w:w="100" w:type="dxa"/>
+              <w:bottom w:w="60" w:type="dxa"/>
+              <w:right w:w="100" w:type="dxa"/>
+            </w:tcMar>
+            <w:shd w:fill="F3F6F8"/>
+          </w:tcPr>
+          <w:p>
+            <w:pPr>
+              <w:keepNext w:val="0"/>
+              <w:spacing w:before="0" w:after="20" w:line="252" w:lineRule="auto"/>
+            </w:pPr>
+            <w:r>
+              <w:rPr>
+                <w:b w:val="0"/>
+                <w:color w:val="000000"/>
+                <w:sz w:val="21"/>
+              </w:rPr>
+              <w:t>Crear oficina y usuarios desde archivos aprobados. --aplicar exige confirmación y respaldo.</w:t>
+            </w:r>
+          </w:p>
+        </w:tc>
+      </w:tr>
+      <w:tr>
+        <w:trPr>
+          <w:cantSplit/>
+          <w:cantSplit/>
+        </w:trPr>
+        <w:tc>
+          <w:tcPr>
+            <w:tcW w:type="dxa" w:w="3024"/>
+            <w:vAlign w:val="center"/>
+            <w:tcBorders>
+              <w:top w:val="single" w:sz="4" w:color="D9D9D9"/>
+              <w:left w:val="single" w:sz="4" w:color="D9D9D9"/>
+              <w:bottom w:val="single" w:sz="4" w:color="D9D9D9"/>
+              <w:right w:val="single" w:sz="4" w:color="D9D9D9"/>
+            </w:tcBorders>
+            <w:tcMar>
+              <w:top w:w="60" w:type="dxa"/>
+              <w:left w:w="100" w:type="dxa"/>
+              <w:bottom w:w="60" w:type="dxa"/>
+              <w:right w:w="100" w:type="dxa"/>
+            </w:tcMar>
+            <w:shd w:fill="FFFFFF"/>
+          </w:tcPr>
+          <w:p>
+            <w:pPr>
+              <w:keepNext w:val="0"/>
+              <w:spacing w:before="0" w:after="20" w:line="252" w:lineRule="auto"/>
+            </w:pPr>
+            <w:r>
+              <w:rPr>
+                <w:b w:val="0"/>
+                <w:color w:val="000000"/>
+                <w:sz w:val="21"/>
+              </w:rPr>
+              <w:t>Limpiar-BD --area</w:t>
+            </w:r>
+          </w:p>
+        </w:tc>
+        <w:tc>
+          <w:tcPr>
+            <w:tcW w:type="dxa" w:w="6336"/>
+            <w:vAlign w:val="center"/>
+            <w:tcBorders>
+              <w:top w:val="single" w:sz="4" w:color="D9D9D9"/>
+              <w:left w:val="single" w:sz="4" w:color="D9D9D9"/>
+              <w:bottom w:val="single" w:sz="4" w:color="D9D9D9"/>
+              <w:right w:val="single" w:sz="4" w:color="D9D9D9"/>
+            </w:tcBorders>
+            <w:tcMar>
+              <w:top w:w="60" w:type="dxa"/>
+              <w:left w:w="100" w:type="dxa"/>
+              <w:bottom w:w="60" w:type="dxa"/>
+              <w:right w:w="100" w:type="dxa"/>
+            </w:tcMar>
+            <w:shd w:fill="FFFFFF"/>
+          </w:tcPr>
+          <w:p>
+            <w:pPr>
+              <w:keepNext w:val="0"/>
+              <w:spacing w:before="0" w:after="20" w:line="252" w:lineRule="auto"/>
+            </w:pPr>
+            <w:r>
+              <w:rPr>
+                <w:b w:val="0"/>
+                <w:color w:val="000000"/>
+                <w:sz w:val="21"/>
+              </w:rPr>
+              <w:t>Retirar una oficina rastreada sin documentos ni referencias que bloqueen el retiro.</w:t>
+            </w:r>
+          </w:p>
+        </w:tc>
+      </w:tr>
+      <w:tr>
+        <w:trPr>
+          <w:cantSplit/>
+          <w:cantSplit/>
+        </w:trPr>
+        <w:tc>
+          <w:tcPr>
+            <w:tcW w:type="dxa" w:w="3024"/>
+            <w:vAlign w:val="center"/>
+            <w:tcBorders>
+              <w:top w:val="single" w:sz="4" w:color="D9D9D9"/>
+              <w:left w:val="single" w:sz="4" w:color="D9D9D9"/>
+              <w:bottom w:val="single" w:sz="4" w:color="D9D9D9"/>
+              <w:right w:val="single" w:sz="4" w:color="D9D9D9"/>
+            </w:tcBorders>
+            <w:tcMar>
+              <w:top w:w="60" w:type="dxa"/>
+              <w:left w:w="100" w:type="dxa"/>
+              <w:bottom w:w="60" w:type="dxa"/>
+              <w:right w:w="100" w:type="dxa"/>
+            </w:tcMar>
+            <w:shd w:fill="F3F6F8"/>
+          </w:tcPr>
+          <w:p>
+            <w:pPr>
+              <w:keepNext w:val="0"/>
+              <w:spacing w:before="0" w:after="20" w:line="252" w:lineRule="auto"/>
+            </w:pPr>
+            <w:r>
+              <w:rPr>
+                <w:b w:val="0"/>
+                <w:color w:val="000000"/>
+                <w:sz w:val="21"/>
+              </w:rPr>
+              <w:t>Limpiar-BD --todo</w:t>
+            </w:r>
+          </w:p>
+        </w:tc>
+        <w:tc>
+          <w:tcPr>
+            <w:tcW w:type="dxa" w:w="6336"/>
+            <w:vAlign w:val="center"/>
+            <w:tcBorders>
+              <w:top w:val="single" w:sz="4" w:color="D9D9D9"/>
+              <w:left w:val="single" w:sz="4" w:color="D9D9D9"/>
+              <w:bottom w:val="single" w:sz="4" w:color="D9D9D9"/>
+              <w:right w:val="single" w:sz="4" w:color="D9D9D9"/>
+            </w:tcBorders>
+            <w:tcMar>
+              <w:top w:w="60" w:type="dxa"/>
+              <w:left w:w="100" w:type="dxa"/>
+              <w:bottom w:w="60" w:type="dxa"/>
+              <w:right w:w="100" w:type="dxa"/>
+            </w:tcMar>
+            <w:shd w:fill="F3F6F8"/>
+          </w:tcPr>
+          <w:p>
+            <w:pPr>
+              <w:keepNext w:val="0"/>
+              <w:spacing w:before="0" w:after="20" w:line="252" w:lineRule="auto"/>
+            </w:pPr>
+            <w:r>
+              <w:rPr>
+                <w:b w:val="0"/>
+                <w:color w:val="000000"/>
+                <w:sz w:val="21"/>
+              </w:rPr>
+              <w:t>Reiniciar toda la base local del piloto, con respaldo, y volver a cargar las oficinas. Elimina documentos y usuarios reales.</w:t>
+            </w:r>
+          </w:p>
+        </w:tc>
+      </w:tr>
+      <w:tr>
+        <w:trPr>
+          <w:cantSplit/>
+          <w:cantSplit/>
+        </w:trPr>
+        <w:tc>
+          <w:tcPr>
+            <w:tcW w:type="dxa" w:w="3024"/>
+            <w:vAlign w:val="center"/>
+            <w:tcBorders>
+              <w:top w:val="single" w:sz="4" w:color="D9D9D9"/>
+              <w:left w:val="single" w:sz="4" w:color="D9D9D9"/>
+              <w:bottom w:val="single" w:sz="4" w:color="D9D9D9"/>
+              <w:right w:val="single" w:sz="4" w:color="D9D9D9"/>
+            </w:tcBorders>
+            <w:tcMar>
+              <w:top w:w="60" w:type="dxa"/>
+              <w:left w:w="100" w:type="dxa"/>
+              <w:bottom w:w="60" w:type="dxa"/>
+              <w:right w:w="100" w:type="dxa"/>
+            </w:tcMar>
+            <w:shd w:fill="FFFFFF"/>
+          </w:tcPr>
+          <w:p>
+            <w:pPr>
+              <w:keepNext w:val="0"/>
+              <w:spacing w:before="0" w:after="20" w:line="252" w:lineRule="auto"/>
+            </w:pPr>
+            <w:r>
+              <w:rPr>
+                <w:b w:val="0"/>
+                <w:color w:val="000000"/>
+                <w:sz w:val="21"/>
+              </w:rPr>
+              <w:t>Recargar-Usuarios</w:t>
+            </w:r>
+          </w:p>
+        </w:tc>
+        <w:tc>
+          <w:tcPr>
+            <w:tcW w:type="dxa" w:w="6336"/>
+            <w:vAlign w:val="center"/>
+            <w:tcBorders>
+              <w:top w:val="single" w:sz="4" w:color="D9D9D9"/>
+              <w:left w:val="single" w:sz="4" w:color="D9D9D9"/>
+              <w:bottom w:val="single" w:sz="4" w:color="D9D9D9"/>
+              <w:right w:val="single" w:sz="4" w:color="D9D9D9"/>
+            </w:tcBorders>
+            <w:tcMar>
+              <w:top w:w="60" w:type="dxa"/>
+              <w:left w:w="100" w:type="dxa"/>
+              <w:bottom w:w="60" w:type="dxa"/>
+              <w:right w:w="100" w:type="dxa"/>
+            </w:tcMar>
+            <w:shd w:fill="FFFFFF"/>
+          </w:tcPr>
+          <w:p>
+            <w:pPr>
+              <w:keepNext w:val="0"/>
+              <w:spacing w:before="0" w:after="20" w:line="252" w:lineRule="auto"/>
+            </w:pPr>
+            <w:r>
+              <w:rPr>
+                <w:b w:val="0"/>
+                <w:color w:val="000000"/>
+                <w:sz w:val="21"/>
+              </w:rPr>
+              <w:t>Corregir el alcance de acceso de cuentas ya cargadas, individualmente o por lote. Conserva documentos y claves.</w:t>
+            </w:r>
+          </w:p>
+        </w:tc>
+      </w:tr>
+      <w:tr>
+        <w:trPr>
+          <w:cantSplit/>
+          <w:cantSplit/>
+        </w:trPr>
+        <w:tc>
+          <w:tcPr>
+            <w:tcW w:type="dxa" w:w="3024"/>
+            <w:vAlign w:val="center"/>
+            <w:tcBorders>
+              <w:top w:val="single" w:sz="4" w:color="D9D9D9"/>
+              <w:left w:val="single" w:sz="4" w:color="D9D9D9"/>
+              <w:bottom w:val="single" w:sz="4" w:color="D9D9D9"/>
+              <w:right w:val="single" w:sz="4" w:color="D9D9D9"/>
+            </w:tcBorders>
+            <w:tcMar>
+              <w:top w:w="60" w:type="dxa"/>
+              <w:left w:w="100" w:type="dxa"/>
+              <w:bottom w:w="60" w:type="dxa"/>
+              <w:right w:w="100" w:type="dxa"/>
+            </w:tcMar>
+            <w:shd w:fill="F3F6F8"/>
+          </w:tcPr>
+          <w:p>
+            <w:pPr>
+              <w:keepNext w:val="0"/>
+              <w:spacing w:before="0" w:after="20" w:line="252" w:lineRule="auto"/>
+            </w:pPr>
+            <w:r>
+              <w:rPr>
+                <w:b w:val="0"/>
+                <w:color w:val="000000"/>
+                <w:sz w:val="21"/>
+              </w:rPr>
+              <w:t>Limpiar-Payara</w:t>
+            </w:r>
+          </w:p>
+        </w:tc>
+        <w:tc>
+          <w:tcPr>
+            <w:tcW w:type="dxa" w:w="6336"/>
+            <w:vAlign w:val="center"/>
+            <w:tcBorders>
+              <w:top w:val="single" w:sz="4" w:color="D9D9D9"/>
+              <w:left w:val="single" w:sz="4" w:color="D9D9D9"/>
+              <w:bottom w:val="single" w:sz="4" w:color="D9D9D9"/>
+              <w:right w:val="single" w:sz="4" w:color="D9D9D9"/>
+            </w:tcBorders>
+            <w:tcMar>
+              <w:top w:w="60" w:type="dxa"/>
+              <w:left w:w="100" w:type="dxa"/>
+              <w:bottom w:w="60" w:type="dxa"/>
+              <w:right w:w="100" w:type="dxa"/>
+            </w:tcMar>
+            <w:shd w:fill="F3F6F8"/>
+          </w:tcPr>
+          <w:p>
+            <w:pPr>
+              <w:keepNext w:val="0"/>
+              <w:spacing w:before="0" w:after="20" w:line="252" w:lineRule="auto"/>
+            </w:pPr>
+            <w:r>
+              <w:rPr>
+                <w:b w:val="0"/>
+                <w:color w:val="000000"/>
+                <w:sz w:val="21"/>
+              </w:rPr>
+              <w:t>Revisar o retirar cachés, archivos generados, temporales y logs; conserva configuración y aplicaciones. Disponible para Windows.</w:t>
+            </w:r>
+          </w:p>
+        </w:tc>
+      </w:tr>
+      <w:tr>
+        <w:trPr>
+          <w:cantSplit/>
+          <w:cantSplit/>
+        </w:trPr>
+        <w:tc>
+          <w:tcPr>
+            <w:tcW w:type="dxa" w:w="3024"/>
+            <w:vAlign w:val="center"/>
+            <w:tcBorders>
+              <w:top w:val="single" w:sz="4" w:color="D9D9D9"/>
+              <w:left w:val="single" w:sz="4" w:color="D9D9D9"/>
+              <w:bottom w:val="single" w:sz="4" w:color="D9D9D9"/>
+              <w:right w:val="single" w:sz="4" w:color="D9D9D9"/>
+            </w:tcBorders>
+            <w:tcMar>
+              <w:top w:w="60" w:type="dxa"/>
+              <w:left w:w="100" w:type="dxa"/>
+              <w:bottom w:w="60" w:type="dxa"/>
+              <w:right w:w="100" w:type="dxa"/>
+            </w:tcMar>
+            <w:shd w:fill="FFFFFF"/>
+          </w:tcPr>
+          <w:p>
+            <w:pPr>
+              <w:keepNext w:val="0"/>
+              <w:spacing w:before="0" w:after="20" w:line="252" w:lineRule="auto"/>
+            </w:pPr>
+            <w:r>
+              <w:rPr>
+                <w:b w:val="0"/>
+                <w:color w:val="000000"/>
+                <w:sz w:val="21"/>
+              </w:rPr>
+              <w:t>Plantillas-SGD</w:t>
+            </w:r>
+          </w:p>
+        </w:tc>
+        <w:tc>
+          <w:tcPr>
+            <w:tcW w:type="dxa" w:w="6336"/>
+            <w:vAlign w:val="center"/>
+            <w:tcBorders>
+              <w:top w:val="single" w:sz="4" w:color="D9D9D9"/>
+              <w:left w:val="single" w:sz="4" w:color="D9D9D9"/>
+              <w:bottom w:val="single" w:sz="4" w:color="D9D9D9"/>
+              <w:right w:val="single" w:sz="4" w:color="D9D9D9"/>
+            </w:tcBorders>
+            <w:tcMar>
+              <w:top w:w="60" w:type="dxa"/>
+              <w:left w:w="100" w:type="dxa"/>
+              <w:bottom w:w="60" w:type="dxa"/>
+              <w:right w:w="100" w:type="dxa"/>
+            </w:tcMar>
+            <w:shd w:fill="FFFFFF"/>
+          </w:tcPr>
+          <w:p>
+            <w:pPr>
+              <w:keepNext w:val="0"/>
+              <w:spacing w:before="0" w:after="20" w:line="252" w:lineRule="auto"/>
+            </w:pPr>
+            <w:r>
+              <w:rPr>
+                <w:b w:val="0"/>
+                <w:color w:val="000000"/>
+                <w:sz w:val="21"/>
+              </w:rPr>
+              <w:t>Validar o aplicar las plantillas globales INFORME y OFICIO con respaldo previo.</w:t>
+            </w:r>
+          </w:p>
+        </w:tc>
+      </w:tr>
+      <w:tr>
+        <w:trPr>
+          <w:cantSplit/>
+          <w:cantSplit/>
+        </w:trPr>
+        <w:tc>
+          <w:tcPr>
+            <w:tcW w:type="dxa" w:w="3024"/>
+            <w:vAlign w:val="center"/>
+            <w:tcBorders>
+              <w:top w:val="single" w:sz="4" w:color="D9D9D9"/>
+              <w:left w:val="single" w:sz="4" w:color="D9D9D9"/>
+              <w:bottom w:val="single" w:sz="4" w:color="D9D9D9"/>
+              <w:right w:val="single" w:sz="4" w:color="D9D9D9"/>
+            </w:tcBorders>
+            <w:tcMar>
+              <w:top w:w="60" w:type="dxa"/>
+              <w:left w:w="100" w:type="dxa"/>
+              <w:bottom w:w="60" w:type="dxa"/>
+              <w:right w:w="100" w:type="dxa"/>
+            </w:tcMar>
+            <w:shd w:fill="F3F6F8"/>
+          </w:tcPr>
+          <w:p>
+            <w:pPr>
+              <w:keepNext w:val="0"/>
+              <w:spacing w:before="0" w:after="20" w:line="252" w:lineRule="auto"/>
+            </w:pPr>
+            <w:r>
+              <w:rPr>
+                <w:b w:val="0"/>
+                <w:color w:val="000000"/>
+                <w:sz w:val="21"/>
+              </w:rPr>
+              <w:t>ACTIVAR-MEMORIA-PAYARA.ps1</w:t>
+            </w:r>
+          </w:p>
+        </w:tc>
+        <w:tc>
+          <w:tcPr>
+            <w:tcW w:type="dxa" w:w="6336"/>
+            <w:vAlign w:val="center"/>
+            <w:tcBorders>
+              <w:top w:val="single" w:sz="4" w:color="D9D9D9"/>
+              <w:left w:val="single" w:sz="4" w:color="D9D9D9"/>
+              <w:bottom w:val="single" w:sz="4" w:color="D9D9D9"/>
+              <w:right w:val="single" w:sz="4" w:color="D9D9D9"/>
+            </w:tcBorders>
+            <w:tcMar>
+              <w:top w:w="60" w:type="dxa"/>
+              <w:left w:w="100" w:type="dxa"/>
+              <w:bottom w:w="60" w:type="dxa"/>
+              <w:right w:w="100" w:type="dxa"/>
+            </w:tcMar>
+            <w:shd w:fill="F3F6F8"/>
+          </w:tcPr>
+          <w:p>
+            <w:pPr>
+              <w:keepNext w:val="0"/>
+              <w:spacing w:before="0" w:after="20" w:line="252" w:lineRule="auto"/>
+            </w:pPr>
+            <w:r>
+              <w:rPr>
+                <w:b w:val="0"/>
+                <w:color w:val="000000"/>
+                <w:sz w:val="21"/>
+              </w:rPr>
+              <w:t>Aplicar el heap aprobado a un dominio existente; seguir AJUSTE-MEMORIA-PAYARA.md.</w:t>
+            </w:r>
+          </w:p>
+        </w:tc>
+      </w:tr>
+      <w:tr>
+        <w:trPr>
+          <w:cantSplit/>
+          <w:cantSplit/>
+        </w:trPr>
+        <w:tc>
+          <w:tcPr>
+            <w:tcW w:type="dxa" w:w="3024"/>
+            <w:vAlign w:val="center"/>
+            <w:tcBorders>
+              <w:top w:val="single" w:sz="4" w:color="D9D9D9"/>
+              <w:left w:val="single" w:sz="4" w:color="D9D9D9"/>
+              <w:bottom w:val="single" w:sz="4" w:color="D9D9D9"/>
+              <w:right w:val="single" w:sz="4" w:color="D9D9D9"/>
+            </w:tcBorders>
+            <w:tcMar>
+              <w:top w:w="60" w:type="dxa"/>
+              <w:left w:w="100" w:type="dxa"/>
+              <w:bottom w:w="60" w:type="dxa"/>
+              <w:right w:w="100" w:type="dxa"/>
+            </w:tcMar>
+            <w:shd w:fill="FFFFFF"/>
+          </w:tcPr>
+          <w:p>
+            <w:pPr>
+              <w:keepNext w:val="0"/>
+              <w:spacing w:before="0" w:after="20" w:line="252" w:lineRule="auto"/>
+            </w:pPr>
+            <w:r>
+              <w:rPr>
+                <w:b w:val="0"/>
+                <w:color w:val="000000"/>
+                <w:sz w:val="21"/>
+              </w:rPr>
+              <w:t>configuracion_payara.py</w:t>
+            </w:r>
+          </w:p>
+        </w:tc>
+        <w:tc>
+          <w:tcPr>
+            <w:tcW w:type="dxa" w:w="6336"/>
+            <w:vAlign w:val="center"/>
+            <w:tcBorders>
+              <w:top w:val="single" w:sz="4" w:color="D9D9D9"/>
+              <w:left w:val="single" w:sz="4" w:color="D9D9D9"/>
+              <w:bottom w:val="single" w:sz="4" w:color="D9D9D9"/>
+              <w:right w:val="single" w:sz="4" w:color="D9D9D9"/>
+            </w:tcBorders>
+            <w:tcMar>
+              <w:top w:w="60" w:type="dxa"/>
+              <w:left w:w="100" w:type="dxa"/>
+              <w:bottom w:w="60" w:type="dxa"/>
+              <w:right w:w="100" w:type="dxa"/>
+            </w:tcMar>
+            <w:shd w:fill="FFFFFF"/>
+          </w:tcPr>
+          <w:p>
+            <w:pPr>
+              <w:keepNext w:val="0"/>
+              <w:spacing w:before="0" w:after="20" w:line="252" w:lineRule="auto"/>
+            </w:pPr>
+            <w:r>
+              <w:rPr>
+                <w:b w:val="0"/>
+                <w:color w:val="000000"/>
+                <w:sz w:val="21"/>
+              </w:rPr>
+              <w:t>Exportar, verificar o restaurar una copia de configuración. La restauración requiere dominio detenido y revisión del destino.</w:t>
+            </w:r>
+          </w:p>
+        </w:tc>
+      </w:tr>
+      <w:tr>
+        <w:trPr>
+          <w:cantSplit/>
+          <w:cantSplit/>
+        </w:trPr>
+        <w:tc>
+          <w:tcPr>
+            <w:tcW w:type="dxa" w:w="3024"/>
+            <w:vAlign w:val="center"/>
+            <w:tcBorders>
+              <w:top w:val="single" w:sz="4" w:color="D9D9D9"/>
+              <w:left w:val="single" w:sz="4" w:color="D9D9D9"/>
+              <w:bottom w:val="single" w:sz="4" w:color="D9D9D9"/>
+              <w:right w:val="single" w:sz="4" w:color="D9D9D9"/>
+            </w:tcBorders>
+            <w:tcMar>
+              <w:top w:w="60" w:type="dxa"/>
+              <w:left w:w="100" w:type="dxa"/>
+              <w:bottom w:w="60" w:type="dxa"/>
+              <w:right w:w="100" w:type="dxa"/>
+            </w:tcMar>
+            <w:shd w:fill="F3F6F8"/>
+          </w:tcPr>
+          <w:p>
+            <w:pPr>
+              <w:keepNext w:val="0"/>
+              <w:spacing w:before="0" w:after="20" w:line="252" w:lineRule="auto"/>
+            </w:pPr>
+            <w:r>
+              <w:rPr>
+                <w:b w:val="0"/>
+                <w:color w:val="000000"/>
+                <w:sz w:val="21"/>
+              </w:rPr>
+              <w:t>SUBIR-CONFIGURACION-PAYARA.ps1</w:t>
+            </w:r>
+          </w:p>
+        </w:tc>
+        <w:tc>
+          <w:tcPr>
+            <w:tcW w:type="dxa" w:w="6336"/>
+            <w:vAlign w:val="center"/>
+            <w:tcBorders>
+              <w:top w:val="single" w:sz="4" w:color="D9D9D9"/>
+              <w:left w:val="single" w:sz="4" w:color="D9D9D9"/>
+              <w:bottom w:val="single" w:sz="4" w:color="D9D9D9"/>
+              <w:right w:val="single" w:sz="4" w:color="D9D9D9"/>
+            </w:tcBorders>
+            <w:tcMar>
+              <w:top w:w="60" w:type="dxa"/>
+              <w:left w:w="100" w:type="dxa"/>
+              <w:bottom w:w="60" w:type="dxa"/>
+              <w:right w:w="100" w:type="dxa"/>
+            </w:tcMar>
+            <w:shd w:fill="F3F6F8"/>
+          </w:tcPr>
+          <w:p>
+            <w:pPr>
+              <w:keepNext w:val="0"/>
+              <w:spacing w:before="0" w:after="20" w:line="252" w:lineRule="auto"/>
+            </w:pPr>
+            <w:r>
+              <w:rPr>
+                <w:b w:val="0"/>
+                <w:color w:val="000000"/>
+                <w:sz w:val="21"/>
+              </w:rPr>
+              <w:t>Verificar la copia, preparar git add ., revisar y crear commit. -Publicar también hace push; usar cuando la entrega esté revisada.</w:t>
+            </w:r>
+          </w:p>
+        </w:tc>
+      </w:tr>
+    </w:tbl>
     <w:sectPr>
       <w:headerReference w:type="default" r:id="rId9"/>
       <w:footerReference w:type="default" r:id="rId10"/>
@@ -1787,7 +3228,7 @@
       <w:rPr>
         <w:sz w:val="18"/>
       </w:rPr>
-      <w:t xml:space="preserve">Windows / Linux x64 · Edición 09/10/2026                                      Página </w:t>
+      <w:t xml:space="preserve">Windows / Linux x64 · Edición 10/10/2026                                      Página </w:t>
     </w:r>
     <w:fldSimple w:instr="PAGE"/>
   </w:p>
@@ -2290,7 +3731,7 @@
       <w:rFonts w:asciiTheme="majorHAnsi" w:eastAsiaTheme="majorEastAsia" w:hAnsiTheme="majorHAnsi" w:cstheme="majorBidi"/>
       <w:b/>
       <w:bCs/>
-      <w:color w:val="4F81BD" w:themeColor="accent1"/>
+      <w:color w:val="000000"/>
     </w:rPr>
   </w:style>
   <w:style w:type="paragraph" w:styleId="Heading4">
@@ -13859,6 +15300,17 @@
         <w:shd w:val="clear" w:color="auto" w:fill="FBCAA2" w:themeFill="accent6" w:themeFillTint="7F"/>
       </w:tcPr>
     </w:tblStylePr>
+  </w:style>
+  <w:style w:type="paragraph" w:customStyle="1" w:styleId="ComandoSGD">
+    <w:name w:val="Comando SGD"/>
+    <w:pPr>
+      <w:keepLines/>
+      <w:spacing w:before="60" w:after="120"/>
+    </w:pPr>
+    <w:rPr>
+      <w:rFonts w:ascii="Consolas" w:hAnsi="Consolas"/>
+      <w:sz w:val="18"/>
+    </w:rPr>
   </w:style>
 </w:styles>
 </file>

</xml_diff>